<commit_message>
Motion Detected guide, revision 2: the film changes shape at 55 s
Stations 05-07 rebuilt: a year ticker through 74 years of reef recovery with a
relapse, one full night per era at the waterhole, and a finale where the camera
is seen in the cat's eye, knocked down and perched on; a closing register of
all seven 2100 frames. Adds a 2026/2100 alignment table and QA for the new beats.

Co-Authored-By: Claude Fable 5.1 <noreply@anthropic.com>
Claude-Session: https://claude.ai/code/session_01Gw2TNCA3kZvybTQmQHep3g
</commit_message>
<xml_diff>
--- a/good-food-no-dead-ends/briefs/Motion_Detected_2100_Production_Guide.docx
+++ b/good-food-no-dead-ends/briefs/Motion_Detected_2100_Production_Guide.docx
@@ -34,7 +34,7 @@
     </w:p>
     <w:p>
       <w:pPr>
-        <w:spacing w:after="240" w:before="0"/>
+        <w:spacing w:after="60" w:before="0"/>
       </w:pPr>
       <w:r>
         <w:rPr>
@@ -44,6 +44,22 @@
           <w:szCs w:val="20"/>
         </w:rPr>
         <w:t xml:space="preserve">Production guide and copy-ready brief · hyperrealistic · one looping GIF and one 90–115 second film · animals only</w:t>
+      </w:r>
+    </w:p>
+    <w:p>
+      <w:pPr>
+        <w:spacing w:after="240" w:before="0"/>
+      </w:pPr>
+      <w:r>
+        <w:rPr>
+          <w:rFonts w:ascii="Calibri" w:cs="Calibri" w:eastAsia="Calibri" w:hAnsi="Calibri"/>
+          <w:b/>
+          <w:bCs/>
+          <w:color w:val="1D6B4F"/>
+          <w:sz w:val="19"/>
+          <w:szCs w:val="19"/>
+        </w:rPr>
+        <w:t xml:space="preserve">REVISION 2 · The first four stations (0–55 s) stand as cut. Everything from 55 s is rebuilt in this revision: the film changes shape there instead of repeating its pattern. Changed sections are marked ▲.</w:t>
       </w:r>
     </w:p>
     <w:p>
@@ -121,7 +137,7 @@
           <w:sz w:val="21"/>
           <w:szCs w:val="21"/>
         </w:rPr>
-        <w:t xml:space="preserve">FILM: 100 seconds (acceptable range 90–115), 1920×1080, 24 or 25 fps, stereo mix, captions file. Seven stations: Iberian scrubland (Spain), hedgerow flower (England), building ledge in a city (any European city), Appalachian mountain stream underwater (USA), kelp reef underwater (California), recovering savanna park (Mozambique), mangrove creek (Sundarbans). No voice-over. The only text on screen is the camera metadata (station number, date, time, temperature) and seven short typed log lines. Finish on a 2100 clip where an animal walks straight up to the lens.</w:t>
+        <w:t xml:space="preserve">FILM: 100 seconds (acceptable range 90–115), 1920×1080, 24 or 25 fps, stereo mix, captions file. Seven stations in three movements. Movement one (0–55 s, four stations, as already cut): Iberian scrubland, hedgerow flower, city ledge, Appalachian stream, each a 2026 clip then a 2100 clip. Movement two (55–83 s) breaks the pattern twice: Station 05 (kelp reef, California) is one frame whose timestamp runs through every year from 2026 to 2100 while the reef regrows and relapses; Station 06 (waterhole, Mozambique) is one whole night in each era, fast-forwarded, so the contrast is how many come through, not whether one does. Movement three (83–100 s) is the payoff: Station 07 (mangrove creek, Sundarbans) ends with the fishing cat knocking the camera over and a kingfisher landing on the fallen housing, then the register: a wall of all seven 2100 frames with the film's own species count for each era. No voice-over. The only text on screen is camera metadata (station, date, time, temperature) and short typed log lines.</w:t>
       </w:r>
     </w:p>
     <w:p>
@@ -3220,7 +3236,7 @@
                 <w:sz w:val="18"/>
                 <w:szCs w:val="18"/>
               </w:rPr>
-              <w:t xml:space="preserve">05 · Rocky reef, Monterey Bay, California</w:t>
+              <w:t xml:space="preserve">▲ 05 · Rocky reef, Monterey Bay, California — THE LONG WATCH</w:t>
             </w:r>
           </w:p>
         </w:tc>
@@ -3248,7 +3264,7 @@
                 <w:sz w:val="18"/>
                 <w:szCs w:val="18"/>
               </w:rPr>
-              <w:t xml:space="preserve">Underwater trap on a weighted frame, 4 m depth, looking across the rock.</w:t>
+              <w:t xml:space="preserve">Underwater trap on a weighted frame, 4 m depth, looking across the rock. One frame for the whole station.</w:t>
             </w:r>
           </w:p>
         </w:tc>
@@ -3276,7 +3292,7 @@
                 <w:sz w:val="18"/>
                 <w:szCs w:val="18"/>
               </w:rPr>
-              <w:t xml:space="preserve">2026, 10:00: purple urchins carpeting bare rock, a single stunted kelp stipe, a sheephead passing.</w:t>
+              <w:t xml:space="preserve">No separate 2026 clip. The frame opens on 2026-10-04 · 10:00: purple urchins carpeting bare rock, one stunted kelp stipe, a sheephead passing.</w:t>
             </w:r>
           </w:p>
         </w:tc>
@@ -3304,7 +3320,7 @@
                 <w:sz w:val="18"/>
                 <w:szCs w:val="18"/>
               </w:rPr>
-              <w:t xml:space="preserve">2100, 10:00: kelp canopy swaying overhead, light shafts, a sea otter diving down, prying a crab from a crevice, rising out of frame.</w:t>
+              <w:t xml:space="preserve">The year digit of the stamp starts ticking: 2027, 2028 … 2100 in about nine seconds, with holds on 2026, 2034, 2047, 2061, 2083, 2100. Kelp returns in fits: a few stipes by 2034; an otter first appears around 2041; the 2047 hold is a relapse (a marine heatwave year: canopy thinned, urchins back on the rock); by 2061 a full canopy, light shafts, rockfish; 2083 the otter raft; 2100 an otter working the crevice below a canopy that fills the frame.</w:t>
             </w:r>
           </w:p>
         </w:tc>
@@ -3332,7 +3348,7 @@
                 <w:sz w:val="18"/>
                 <w:szCs w:val="18"/>
               </w:rPr>
-              <w:t xml:space="preserve">Urchin management + otter range</w:t>
+              <w:t xml:space="preserve">Urchin management + otter range; recovery shown as a process with a setback, not a switch</w:t>
             </w:r>
           </w:p>
         </w:tc>
@@ -3362,7 +3378,7 @@
                 <w:sz w:val="18"/>
                 <w:szCs w:val="18"/>
               </w:rPr>
-              <w:t xml:space="preserve">06 · Waterhole, Zinave National Park, Mozambique</w:t>
+              <w:t xml:space="preserve">▲ 06 · Waterhole, Zinave National Park, Mozambique — ONE NIGHT</w:t>
             </w:r>
           </w:p>
         </w:tc>
@@ -3390,7 +3406,7 @@
                 <w:sz w:val="18"/>
                 <w:szCs w:val="18"/>
               </w:rPr>
-              <w:t xml:space="preserve">Trap on a stump facing a muddy pan at dusk.</w:t>
+              <w:t xml:space="preserve">Trap on a stump facing a muddy pan. Each era is one whole night, 17:48 to 05:12, fast-forwarded so the clock in the stamp visibly runs.</w:t>
             </w:r>
           </w:p>
         </w:tc>
@@ -3418,7 +3434,7 @@
                 <w:sz w:val="18"/>
                 <w:szCs w:val="18"/>
               </w:rPr>
-              <w:t xml:space="preserve">2026, 17:48: a brown hyaena alone, a wire scar on one foreleg; it drinks, flinches at nothing, leaves.</w:t>
+              <w:t xml:space="preserve">2026: the night runs through at speed; the pan sits empty under the stars; at 02:40 a single brown hyaena, a wire scar on one foreleg, drinks and goes. Dawn. Nothing else came.</w:t>
             </w:r>
           </w:p>
         </w:tc>
@@ -3446,7 +3462,7 @@
                 <w:sz w:val="18"/>
                 <w:szCs w:val="18"/>
               </w:rPr>
-              <w:t xml:space="preserve">2100, 17:48: a hyaena clan with cubs; a lioness arrives and the hyaenas withdraw unhurried; elephant legs cross the foreground in the last second.</w:t>
+              <w:t xml:space="preserve">2100, same night, same speed: the pan never empties. Hyaena clan with cubs at dusk; a lioness at 21:10 and the hyaenas step back; elephants at midnight, legs filling the foreground, the camera jolted but not knocked; impala and warthog in the grey hour; a leopard drinking alone at 04:00; the same dawn.</w:t>
             </w:r>
           </w:p>
         </w:tc>
@@ -3474,7 +3490,7 @@
                 <w:sz w:val="18"/>
                 <w:szCs w:val="18"/>
               </w:rPr>
-              <w:t xml:space="preserve">Snare removal + reintroductions</w:t>
+              <w:t xml:space="preserve">Snare removal + reintroductions; the contrast is throughput, not presence</w:t>
             </w:r>
           </w:p>
         </w:tc>
@@ -3504,7 +3520,7 @@
                 <w:sz w:val="18"/>
                 <w:szCs w:val="18"/>
               </w:rPr>
-              <w:t xml:space="preserve">07 · Tidal creek, Sundarbans</w:t>
+              <w:t xml:space="preserve">▲ 07 · Tidal creek, Sundarbans — THE LOOK</w:t>
             </w:r>
           </w:p>
         </w:tc>
@@ -3532,7 +3548,7 @@
                 <w:sz w:val="18"/>
                 <w:szCs w:val="18"/>
               </w:rPr>
-              <w:t xml:space="preserve">Trap on a mangrove prop root, looking across mud at low tide.</w:t>
+              <w:t xml:space="preserve">Trap on a mangrove prop root, looking across mud at low tide. The 2026 clip is as before; the 2100 clip is the film's last camera-trap footage.</w:t>
             </w:r>
           </w:p>
         </w:tc>
@@ -3560,7 +3576,7 @@
                 <w:sz w:val="18"/>
                 <w:szCs w:val="18"/>
               </w:rPr>
-              <w:t xml:space="preserve">2026, 06:30: a plastic sheet snagged on roots, mudskippers, a crow.</w:t>
+              <w:t xml:space="preserve">2026, 06:30: a plastic sheet snagged on roots, mudskippers, a house crow.</w:t>
             </w:r>
           </w:p>
         </w:tc>
@@ -3588,7 +3604,7 @@
                 <w:sz w:val="18"/>
                 <w:szCs w:val="18"/>
               </w:rPr>
-              <w:t xml:space="preserve">2100, 06:30: a fishing cat wades in, freezes, strikes; comes up with a fish; walks directly toward the camera until its face fills the frame. One bottle still wedged in the roots.</w:t>
+              <w:t xml:space="preserve">2100, 06:30: a fishing cat wades in, freezes, strikes, lifts a fish, then walks to the lens until one eye fills the frame; in the wet of the eye, the camera strapped to its root is reflected, the only thing of ours in the whole film. The cat shoulders the housing; the frame tumbles and settles in the mud looking up through the canopy. A white-throated kingfisher lands on the fallen camera, framed by its own lens hood. One bottle still wedged in the roots.</w:t>
             </w:r>
           </w:p>
         </w:tc>
@@ -3616,7 +3632,972 @@
                 <w:sz w:val="18"/>
                 <w:szCs w:val="18"/>
               </w:rPr>
-              <w:t xml:space="preserve">Mangrove restoration + tide realignment</w:t>
+              <w:t xml:space="preserve">Mangrove restoration + tide realignment; the camera becomes part of the habitat</w:t>
+            </w:r>
+          </w:p>
+        </w:tc>
+      </w:tr>
+    </w:tbl>
+    <w:p>
+      <w:pPr>
+        <w:pStyle w:val="Heading2"/>
+        <w:spacing w:after="100" w:before="220"/>
+      </w:pPr>
+      <w:r>
+        <w:rPr>
+          <w:rFonts w:ascii="Calibri" w:cs="Calibri" w:eastAsia="Calibri" w:hAnsi="Calibri"/>
+          <w:b/>
+          <w:bCs/>
+          <w:color w:val="1F2A24"/>
+          <w:sz w:val="24"/>
+          <w:szCs w:val="24"/>
+        </w:rPr>
+        <w:t xml:space="preserve">▲ Alignment: every 2100 clip answers its 2026 clip</w:t>
+      </w:r>
+    </w:p>
+    <w:p>
+      <w:pPr>
+        <w:spacing w:after="100" w:before="0"/>
+      </w:pPr>
+      <w:r>
+        <w:rPr>
+          <w:rFonts w:ascii="Calibri" w:cs="Calibri" w:eastAsia="Calibri" w:hAnsi="Calibri"/>
+          <w:color w:val="1F2A24"/>
+          <w:sz w:val="21"/>
+          <w:szCs w:val="21"/>
+        </w:rPr>
+        <w:t xml:space="preserve">The two eras must rhyme shot for shot. Each 2100 clip picks up a specific thing from its 2026 clip and resolves, keeps or echoes it. A reviewer checks this table against the cut before anything else.</w:t>
+      </w:r>
+    </w:p>
+    <w:tbl>
+      <w:tblPr>
+        <w:tblW w:type="dxa" w:w="10100"/>
+        <w:tblBorders>
+          <w:top w:val="single" w:color="C9D3CD" w:sz="4"/>
+          <w:left w:val="single" w:color="C9D3CD" w:sz="4"/>
+          <w:bottom w:val="single" w:color="C9D3CD" w:sz="4"/>
+          <w:right w:val="single" w:color="C9D3CD" w:sz="4"/>
+          <w:insideH w:val="single" w:color="C9D3CD" w:sz="4"/>
+          <w:insideV w:val="single" w:color="C9D3CD" w:sz="4"/>
+        </w:tblBorders>
+      </w:tblPr>
+      <w:tblGrid>
+        <w:gridCol w:w="1100"/>
+        <w:gridCol w:w="3100"/>
+        <w:gridCol w:w="3100"/>
+        <w:gridCol w:w="2800"/>
+      </w:tblGrid>
+      <w:tr>
+        <w:trPr>
+          <w:tblHeader/>
+        </w:trPr>
+        <w:tc>
+          <w:tcPr>
+            <w:tcW w:type="dxa" w:w="1100"/>
+            <w:shd w:fill="1D6B4F" w:color="auto" w:val="clear"/>
+            <w:tcMar>
+              <w:top w:type="dxa" w:w="70"/>
+              <w:left w:type="dxa" w:w="100"/>
+              <w:bottom w:type="dxa" w:w="70"/>
+              <w:right w:type="dxa" w:w="100"/>
+            </w:tcMar>
+          </w:tcPr>
+          <w:p>
+            <w:pPr>
+              <w:spacing w:after="40"/>
+            </w:pPr>
+            <w:r>
+              <w:rPr>
+                <w:rFonts w:ascii="Calibri" w:cs="Calibri" w:eastAsia="Calibri" w:hAnsi="Calibri"/>
+                <w:b/>
+                <w:bCs/>
+                <w:color w:val="FFFFFF"/>
+                <w:sz w:val="19"/>
+                <w:szCs w:val="19"/>
+              </w:rPr>
+              <w:t xml:space="preserve">Station</w:t>
+            </w:r>
+          </w:p>
+        </w:tc>
+        <w:tc>
+          <w:tcPr>
+            <w:tcW w:type="dxa" w:w="3100"/>
+            <w:shd w:fill="1D6B4F" w:color="auto" w:val="clear"/>
+            <w:tcMar>
+              <w:top w:type="dxa" w:w="70"/>
+              <w:left w:type="dxa" w:w="100"/>
+              <w:bottom w:type="dxa" w:w="70"/>
+              <w:right w:type="dxa" w:w="100"/>
+            </w:tcMar>
+          </w:tcPr>
+          <w:p>
+            <w:pPr>
+              <w:spacing w:after="40"/>
+            </w:pPr>
+            <w:r>
+              <w:rPr>
+                <w:rFonts w:ascii="Calibri" w:cs="Calibri" w:eastAsia="Calibri" w:hAnsi="Calibri"/>
+                <w:b/>
+                <w:bCs/>
+                <w:color w:val="FFFFFF"/>
+                <w:sz w:val="19"/>
+                <w:szCs w:val="19"/>
+              </w:rPr>
+              <w:t xml:space="preserve">Planted in 2026</w:t>
+            </w:r>
+          </w:p>
+        </w:tc>
+        <w:tc>
+          <w:tcPr>
+            <w:tcW w:type="dxa" w:w="3100"/>
+            <w:shd w:fill="1D6B4F" w:color="auto" w:val="clear"/>
+            <w:tcMar>
+              <w:top w:type="dxa" w:w="70"/>
+              <w:left w:type="dxa" w:w="100"/>
+              <w:bottom w:type="dxa" w:w="70"/>
+              <w:right w:type="dxa" w:w="100"/>
+            </w:tcMar>
+          </w:tcPr>
+          <w:p>
+            <w:pPr>
+              <w:spacing w:after="40"/>
+            </w:pPr>
+            <w:r>
+              <w:rPr>
+                <w:rFonts w:ascii="Calibri" w:cs="Calibri" w:eastAsia="Calibri" w:hAnsi="Calibri"/>
+                <w:b/>
+                <w:bCs/>
+                <w:color w:val="FFFFFF"/>
+                <w:sz w:val="19"/>
+                <w:szCs w:val="19"/>
+              </w:rPr>
+              <w:t xml:space="preserve">Answered in 2100</w:t>
+            </w:r>
+          </w:p>
+        </w:tc>
+        <w:tc>
+          <w:tcPr>
+            <w:tcW w:type="dxa" w:w="2800"/>
+            <w:shd w:fill="1D6B4F" w:color="auto" w:val="clear"/>
+            <w:tcMar>
+              <w:top w:type="dxa" w:w="70"/>
+              <w:left w:type="dxa" w:w="100"/>
+              <w:bottom w:type="dxa" w:w="70"/>
+              <w:right w:type="dxa" w:w="100"/>
+            </w:tcMar>
+          </w:tcPr>
+          <w:p>
+            <w:pPr>
+              <w:spacing w:after="40"/>
+            </w:pPr>
+            <w:r>
+              <w:rPr>
+                <w:rFonts w:ascii="Calibri" w:cs="Calibri" w:eastAsia="Calibri" w:hAnsi="Calibri"/>
+                <w:b/>
+                <w:bCs/>
+                <w:color w:val="FFFFFF"/>
+                <w:sz w:val="19"/>
+                <w:szCs w:val="19"/>
+              </w:rPr>
+              <w:t xml:space="preserve">Kept imperfect</w:t>
+            </w:r>
+          </w:p>
+        </w:tc>
+      </w:tr>
+      <w:tr>
+        <w:tc>
+          <w:tcPr>
+            <w:tcW w:type="dxa" w:w="1100"/>
+            <w:shd w:fill="FFFFFF" w:color="auto" w:val="clear"/>
+            <w:tcMar>
+              <w:top w:type="dxa" w:w="70"/>
+              <w:left w:type="dxa" w:w="100"/>
+              <w:bottom w:type="dxa" w:w="70"/>
+              <w:right w:type="dxa" w:w="100"/>
+            </w:tcMar>
+          </w:tcPr>
+          <w:p>
+            <w:pPr>
+              <w:spacing w:after="40"/>
+            </w:pPr>
+            <w:r>
+              <w:rPr>
+                <w:rFonts w:ascii="Calibri" w:cs="Calibri" w:eastAsia="Calibri" w:hAnsi="Calibri"/>
+                <w:b w:val="false"/>
+                <w:bCs w:val="false"/>
+                <w:color w:val="1F2A24"/>
+                <w:sz w:val="18"/>
+                <w:szCs w:val="18"/>
+              </w:rPr>
+              <w:t xml:space="preserve">01</w:t>
+            </w:r>
+          </w:p>
+        </w:tc>
+        <w:tc>
+          <w:tcPr>
+            <w:tcW w:type="dxa" w:w="3100"/>
+            <w:shd w:fill="FFFFFF" w:color="auto" w:val="clear"/>
+            <w:tcMar>
+              <w:top w:type="dxa" w:w="70"/>
+              <w:left w:type="dxa" w:w="100"/>
+              <w:bottom w:type="dxa" w:w="70"/>
+              <w:right w:type="dxa" w:w="100"/>
+            </w:tcMar>
+          </w:tcPr>
+          <w:p>
+            <w:pPr>
+              <w:spacing w:after="40"/>
+            </w:pPr>
+            <w:r>
+              <w:rPr>
+                <w:rFonts w:ascii="Calibri" w:cs="Calibri" w:eastAsia="Calibri" w:hAnsi="Calibri"/>
+                <w:b w:val="false"/>
+                <w:bCs w:val="false"/>
+                <w:color w:val="1F2A24"/>
+                <w:sz w:val="18"/>
+                <w:szCs w:val="18"/>
+              </w:rPr>
+              <w:t xml:space="preserve">A lynx limping through fast, alone; a guard-rail at far left.</w:t>
+            </w:r>
+          </w:p>
+        </w:tc>
+        <w:tc>
+          <w:tcPr>
+            <w:tcW w:type="dxa" w:w="3100"/>
+            <w:shd w:fill="FFFFFF" w:color="auto" w:val="clear"/>
+            <w:tcMar>
+              <w:top w:type="dxa" w:w="70"/>
+              <w:left w:type="dxa" w:w="100"/>
+              <w:bottom w:type="dxa" w:w="70"/>
+              <w:right w:type="dxa" w:w="100"/>
+            </w:tcMar>
+          </w:tcPr>
+          <w:p>
+            <w:pPr>
+              <w:spacing w:after="40"/>
+            </w:pPr>
+            <w:r>
+              <w:rPr>
+                <w:rFonts w:ascii="Calibri" w:cs="Calibri" w:eastAsia="Calibri" w:hAnsi="Calibri"/>
+                <w:b w:val="false"/>
+                <w:bCs w:val="false"/>
+                <w:color w:val="1F2A24"/>
+                <w:sz w:val="18"/>
+                <w:szCs w:val="18"/>
+              </w:rPr>
+              <w:t xml:space="preserve">A lynx that sits, grooms and brings a kitten; the guard-rail still there.</w:t>
+            </w:r>
+          </w:p>
+        </w:tc>
+        <w:tc>
+          <w:tcPr>
+            <w:tcW w:type="dxa" w:w="2800"/>
+            <w:shd w:fill="FFFFFF" w:color="auto" w:val="clear"/>
+            <w:tcMar>
+              <w:top w:type="dxa" w:w="70"/>
+              <w:left w:type="dxa" w:w="100"/>
+              <w:bottom w:type="dxa" w:w="70"/>
+              <w:right w:type="dxa" w:w="100"/>
+            </w:tcMar>
+          </w:tcPr>
+          <w:p>
+            <w:pPr>
+              <w:spacing w:after="40"/>
+            </w:pPr>
+            <w:r>
+              <w:rPr>
+                <w:rFonts w:ascii="Calibri" w:cs="Calibri" w:eastAsia="Calibri" w:hAnsi="Calibri"/>
+                <w:b w:val="false"/>
+                <w:bCs w:val="false"/>
+                <w:color w:val="1F2A24"/>
+                <w:sz w:val="18"/>
+                <w:szCs w:val="18"/>
+              </w:rPr>
+              <w:t xml:space="preserve">The guard-rail, unchanged: roads did not vanish, they were made survivable.</w:t>
+            </w:r>
+          </w:p>
+        </w:tc>
+      </w:tr>
+      <w:tr>
+        <w:tc>
+          <w:tcPr>
+            <w:tcW w:type="dxa" w:w="1100"/>
+            <w:shd w:fill="F1F5F2" w:color="auto" w:val="clear"/>
+            <w:tcMar>
+              <w:top w:type="dxa" w:w="70"/>
+              <w:left w:type="dxa" w:w="100"/>
+              <w:bottom w:type="dxa" w:w="70"/>
+              <w:right w:type="dxa" w:w="100"/>
+            </w:tcMar>
+          </w:tcPr>
+          <w:p>
+            <w:pPr>
+              <w:spacing w:after="40"/>
+            </w:pPr>
+            <w:r>
+              <w:rPr>
+                <w:rFonts w:ascii="Calibri" w:cs="Calibri" w:eastAsia="Calibri" w:hAnsi="Calibri"/>
+                <w:b w:val="false"/>
+                <w:bCs w:val="false"/>
+                <w:color w:val="1F2A24"/>
+                <w:sz w:val="18"/>
+                <w:szCs w:val="18"/>
+              </w:rPr>
+              <w:t xml:space="preserve">02</w:t>
+            </w:r>
+          </w:p>
+        </w:tc>
+        <w:tc>
+          <w:tcPr>
+            <w:tcW w:type="dxa" w:w="3100"/>
+            <w:shd w:fill="F1F5F2" w:color="auto" w:val="clear"/>
+            <w:tcMar>
+              <w:top w:type="dxa" w:w="70"/>
+              <w:left w:type="dxa" w:w="100"/>
+              <w:bottom w:type="dxa" w:w="70"/>
+              <w:right w:type="dxa" w:w="100"/>
+            </w:tcMar>
+          </w:tcPr>
+          <w:p>
+            <w:pPr>
+              <w:spacing w:after="40"/>
+            </w:pPr>
+            <w:r>
+              <w:rPr>
+                <w:rFonts w:ascii="Calibri" w:cs="Calibri" w:eastAsia="Calibri" w:hAnsi="Calibri"/>
+                <w:b w:val="false"/>
+                <w:bCs w:val="false"/>
+                <w:color w:val="1F2A24"/>
+                <w:sz w:val="18"/>
+                <w:szCs w:val="18"/>
+              </w:rPr>
+              <w:t xml:space="preserve">Two honeybees in ten seconds on one hawthorn spray.</w:t>
+            </w:r>
+          </w:p>
+        </w:tc>
+        <w:tc>
+          <w:tcPr>
+            <w:tcW w:type="dxa" w:w="3100"/>
+            <w:shd w:fill="F1F5F2" w:color="auto" w:val="clear"/>
+            <w:tcMar>
+              <w:top w:type="dxa" w:w="70"/>
+              <w:left w:type="dxa" w:w="100"/>
+              <w:bottom w:type="dxa" w:w="70"/>
+              <w:right w:type="dxa" w:w="100"/>
+            </w:tcMar>
+          </w:tcPr>
+          <w:p>
+            <w:pPr>
+              <w:spacing w:after="40"/>
+            </w:pPr>
+            <w:r>
+              <w:rPr>
+                <w:rFonts w:ascii="Calibri" w:cs="Calibri" w:eastAsia="Calibri" w:hAnsi="Calibri"/>
+                <w:b w:val="false"/>
+                <w:bCs w:val="false"/>
+                <w:color w:val="1F2A24"/>
+                <w:sz w:val="18"/>
+                <w:szCs w:val="18"/>
+              </w:rPr>
+              <w:t xml:space="preserve">The same spray, the same light, uncountable visitors of many kinds.</w:t>
+            </w:r>
+          </w:p>
+        </w:tc>
+        <w:tc>
+          <w:tcPr>
+            <w:tcW w:type="dxa" w:w="2800"/>
+            <w:shd w:fill="F1F5F2" w:color="auto" w:val="clear"/>
+            <w:tcMar>
+              <w:top w:type="dxa" w:w="70"/>
+              <w:left w:type="dxa" w:w="100"/>
+              <w:bottom w:type="dxa" w:w="70"/>
+              <w:right w:type="dxa" w:w="100"/>
+            </w:tcMar>
+          </w:tcPr>
+          <w:p>
+            <w:pPr>
+              <w:spacing w:after="40"/>
+            </w:pPr>
+            <w:r>
+              <w:rPr>
+                <w:rFonts w:ascii="Calibri" w:cs="Calibri" w:eastAsia="Calibri" w:hAnsi="Calibri"/>
+                <w:b w:val="false"/>
+                <w:bCs w:val="false"/>
+                <w:color w:val="1F2A24"/>
+                <w:sz w:val="18"/>
+                <w:szCs w:val="18"/>
+              </w:rPr>
+              <w:t xml:space="preserve">The wheat field behind is still a wheat field.</w:t>
+            </w:r>
+          </w:p>
+        </w:tc>
+      </w:tr>
+      <w:tr>
+        <w:tc>
+          <w:tcPr>
+            <w:tcW w:type="dxa" w:w="1100"/>
+            <w:shd w:fill="FFFFFF" w:color="auto" w:val="clear"/>
+            <w:tcMar>
+              <w:top w:type="dxa" w:w="70"/>
+              <w:left w:type="dxa" w:w="100"/>
+              <w:bottom w:type="dxa" w:w="70"/>
+              <w:right w:type="dxa" w:w="100"/>
+            </w:tcMar>
+          </w:tcPr>
+          <w:p>
+            <w:pPr>
+              <w:spacing w:after="40"/>
+            </w:pPr>
+            <w:r>
+              <w:rPr>
+                <w:rFonts w:ascii="Calibri" w:cs="Calibri" w:eastAsia="Calibri" w:hAnsi="Calibri"/>
+                <w:b w:val="false"/>
+                <w:bCs w:val="false"/>
+                <w:color w:val="1F2A24"/>
+                <w:sz w:val="18"/>
+                <w:szCs w:val="18"/>
+              </w:rPr>
+              <w:t xml:space="preserve">03</w:t>
+            </w:r>
+          </w:p>
+        </w:tc>
+        <w:tc>
+          <w:tcPr>
+            <w:tcW w:type="dxa" w:w="3100"/>
+            <w:shd w:fill="FFFFFF" w:color="auto" w:val="clear"/>
+            <w:tcMar>
+              <w:top w:type="dxa" w:w="70"/>
+              <w:left w:type="dxa" w:w="100"/>
+              <w:bottom w:type="dxa" w:w="70"/>
+              <w:right w:type="dxa" w:w="100"/>
+            </w:tcMar>
+          </w:tcPr>
+          <w:p>
+            <w:pPr>
+              <w:spacing w:after="40"/>
+            </w:pPr>
+            <w:r>
+              <w:rPr>
+                <w:rFonts w:ascii="Calibri" w:cs="Calibri" w:eastAsia="Calibri" w:hAnsi="Calibri"/>
+                <w:b w:val="false"/>
+                <w:bCs w:val="false"/>
+                <w:color w:val="1F2A24"/>
+                <w:sz w:val="18"/>
+                <w:szCs w:val="18"/>
+              </w:rPr>
+              <w:t xml:space="preserve">A swift braking at a cement-sealed hole and finding nothing.</w:t>
+            </w:r>
+          </w:p>
+        </w:tc>
+        <w:tc>
+          <w:tcPr>
+            <w:tcW w:type="dxa" w:w="3100"/>
+            <w:shd w:fill="FFFFFF" w:color="auto" w:val="clear"/>
+            <w:tcMar>
+              <w:top w:type="dxa" w:w="70"/>
+              <w:left w:type="dxa" w:w="100"/>
+              <w:bottom w:type="dxa" w:w="70"/>
+              <w:right w:type="dxa" w:w="100"/>
+            </w:tcMar>
+          </w:tcPr>
+          <w:p>
+            <w:pPr>
+              <w:spacing w:after="40"/>
+            </w:pPr>
+            <w:r>
+              <w:rPr>
+                <w:rFonts w:ascii="Calibri" w:cs="Calibri" w:eastAsia="Calibri" w:hAnsi="Calibri"/>
+                <w:b w:val="false"/>
+                <w:bCs w:val="false"/>
+                <w:color w:val="1F2A24"/>
+                <w:sz w:val="18"/>
+                <w:szCs w:val="18"/>
+              </w:rPr>
+              <w:t xml:space="preserve">The same wall, now with a row of nest bricks; a swift slamming into one.</w:t>
+            </w:r>
+          </w:p>
+        </w:tc>
+        <w:tc>
+          <w:tcPr>
+            <w:tcW w:type="dxa" w:w="2800"/>
+            <w:shd w:fill="FFFFFF" w:color="auto" w:val="clear"/>
+            <w:tcMar>
+              <w:top w:type="dxa" w:w="70"/>
+              <w:left w:type="dxa" w:w="100"/>
+              <w:bottom w:type="dxa" w:w="70"/>
+              <w:right w:type="dxa" w:w="100"/>
+            </w:tcMar>
+          </w:tcPr>
+          <w:p>
+            <w:pPr>
+              <w:spacing w:after="40"/>
+            </w:pPr>
+            <w:r>
+              <w:rPr>
+                <w:rFonts w:ascii="Calibri" w:cs="Calibri" w:eastAsia="Calibri" w:hAnsi="Calibri"/>
+                <w:b w:val="false"/>
+                <w:bCs w:val="false"/>
+                <w:color w:val="1F2A24"/>
+                <w:sz w:val="18"/>
+                <w:szCs w:val="18"/>
+              </w:rPr>
+              <w:t xml:space="preserve">The sealed hole is still visible beside the bricks.</w:t>
+            </w:r>
+          </w:p>
+        </w:tc>
+      </w:tr>
+      <w:tr>
+        <w:tc>
+          <w:tcPr>
+            <w:tcW w:type="dxa" w:w="1100"/>
+            <w:shd w:fill="F1F5F2" w:color="auto" w:val="clear"/>
+            <w:tcMar>
+              <w:top w:type="dxa" w:w="70"/>
+              <w:left w:type="dxa" w:w="100"/>
+              <w:bottom w:type="dxa" w:w="70"/>
+              <w:right w:type="dxa" w:w="100"/>
+            </w:tcMar>
+          </w:tcPr>
+          <w:p>
+            <w:pPr>
+              <w:spacing w:after="40"/>
+            </w:pPr>
+            <w:r>
+              <w:rPr>
+                <w:rFonts w:ascii="Calibri" w:cs="Calibri" w:eastAsia="Calibri" w:hAnsi="Calibri"/>
+                <w:b w:val="false"/>
+                <w:bCs w:val="false"/>
+                <w:color w:val="1F2A24"/>
+                <w:sz w:val="18"/>
+                <w:szCs w:val="18"/>
+              </w:rPr>
+              <w:t xml:space="preserve">04</w:t>
+            </w:r>
+          </w:p>
+        </w:tc>
+        <w:tc>
+          <w:tcPr>
+            <w:tcW w:type="dxa" w:w="3100"/>
+            <w:shd w:fill="F1F5F2" w:color="auto" w:val="clear"/>
+            <w:tcMar>
+              <w:top w:type="dxa" w:w="70"/>
+              <w:left w:type="dxa" w:w="100"/>
+              <w:bottom w:type="dxa" w:w="70"/>
+              <w:right w:type="dxa" w:w="100"/>
+            </w:tcMar>
+          </w:tcPr>
+          <w:p>
+            <w:pPr>
+              <w:spacing w:after="40"/>
+            </w:pPr>
+            <w:r>
+              <w:rPr>
+                <w:rFonts w:ascii="Calibri" w:cs="Calibri" w:eastAsia="Calibri" w:hAnsi="Calibri"/>
+                <w:b w:val="false"/>
+                <w:bCs w:val="false"/>
+                <w:color w:val="1F2A24"/>
+                <w:sz w:val="18"/>
+                <w:szCs w:val="18"/>
+              </w:rPr>
+              <w:t xml:space="preserve">Brown silted water; a crayfish; nothing larger.</w:t>
+            </w:r>
+          </w:p>
+        </w:tc>
+        <w:tc>
+          <w:tcPr>
+            <w:tcW w:type="dxa" w:w="3100"/>
+            <w:shd w:fill="F1F5F2" w:color="auto" w:val="clear"/>
+            <w:tcMar>
+              <w:top w:type="dxa" w:w="70"/>
+              <w:left w:type="dxa" w:w="100"/>
+              <w:bottom w:type="dxa" w:w="70"/>
+              <w:right w:type="dxa" w:w="100"/>
+            </w:tcMar>
+          </w:tcPr>
+          <w:p>
+            <w:pPr>
+              <w:spacing w:after="40"/>
+            </w:pPr>
+            <w:r>
+              <w:rPr>
+                <w:rFonts w:ascii="Calibri" w:cs="Calibri" w:eastAsia="Calibri" w:hAnsi="Calibri"/>
+                <w:b w:val="false"/>
+                <w:bCs w:val="false"/>
+                <w:color w:val="1F2A24"/>
+                <w:sz w:val="18"/>
+                <w:szCs w:val="18"/>
+              </w:rPr>
+              <w:t xml:space="preserve">Clear water over the same boulders; a hellbender from under the same slab.</w:t>
+            </w:r>
+          </w:p>
+        </w:tc>
+        <w:tc>
+          <w:tcPr>
+            <w:tcW w:type="dxa" w:w="2800"/>
+            <w:shd w:fill="F1F5F2" w:color="auto" w:val="clear"/>
+            <w:tcMar>
+              <w:top w:type="dxa" w:w="70"/>
+              <w:left w:type="dxa" w:w="100"/>
+              <w:bottom w:type="dxa" w:w="70"/>
+              <w:right w:type="dxa" w:w="100"/>
+            </w:tcMar>
+          </w:tcPr>
+          <w:p>
+            <w:pPr>
+              <w:spacing w:after="40"/>
+            </w:pPr>
+            <w:r>
+              <w:rPr>
+                <w:rFonts w:ascii="Calibri" w:cs="Calibri" w:eastAsia="Calibri" w:hAnsi="Calibri"/>
+                <w:b w:val="false"/>
+                <w:bCs w:val="false"/>
+                <w:color w:val="1F2A24"/>
+                <w:sz w:val="18"/>
+                <w:szCs w:val="18"/>
+              </w:rPr>
+              <w:t xml:space="preserve">A rusted culvert ring in the far background, cleaner but present.</w:t>
+            </w:r>
+          </w:p>
+        </w:tc>
+      </w:tr>
+      <w:tr>
+        <w:tc>
+          <w:tcPr>
+            <w:tcW w:type="dxa" w:w="1100"/>
+            <w:shd w:fill="FFFFFF" w:color="auto" w:val="clear"/>
+            <w:tcMar>
+              <w:top w:type="dxa" w:w="70"/>
+              <w:left w:type="dxa" w:w="100"/>
+              <w:bottom w:type="dxa" w:w="70"/>
+              <w:right w:type="dxa" w:w="100"/>
+            </w:tcMar>
+          </w:tcPr>
+          <w:p>
+            <w:pPr>
+              <w:spacing w:after="40"/>
+            </w:pPr>
+            <w:r>
+              <w:rPr>
+                <w:rFonts w:ascii="Calibri" w:cs="Calibri" w:eastAsia="Calibri" w:hAnsi="Calibri"/>
+                <w:b w:val="false"/>
+                <w:bCs w:val="false"/>
+                <w:color w:val="1F2A24"/>
+                <w:sz w:val="18"/>
+                <w:szCs w:val="18"/>
+              </w:rPr>
+              <w:t xml:space="preserve">05</w:t>
+            </w:r>
+          </w:p>
+        </w:tc>
+        <w:tc>
+          <w:tcPr>
+            <w:tcW w:type="dxa" w:w="3100"/>
+            <w:shd w:fill="FFFFFF" w:color="auto" w:val="clear"/>
+            <w:tcMar>
+              <w:top w:type="dxa" w:w="70"/>
+              <w:left w:type="dxa" w:w="100"/>
+              <w:bottom w:type="dxa" w:w="70"/>
+              <w:right w:type="dxa" w:w="100"/>
+            </w:tcMar>
+          </w:tcPr>
+          <w:p>
+            <w:pPr>
+              <w:spacing w:after="40"/>
+            </w:pPr>
+            <w:r>
+              <w:rPr>
+                <w:rFonts w:ascii="Calibri" w:cs="Calibri" w:eastAsia="Calibri" w:hAnsi="Calibri"/>
+                <w:b w:val="false"/>
+                <w:bCs w:val="false"/>
+                <w:color w:val="1F2A24"/>
+                <w:sz w:val="18"/>
+                <w:szCs w:val="18"/>
+              </w:rPr>
+              <w:t xml:space="preserve">Urchins on bare rock, one stunted stipe (the first frame of the ticker).</w:t>
+            </w:r>
+          </w:p>
+        </w:tc>
+        <w:tc>
+          <w:tcPr>
+            <w:tcW w:type="dxa" w:w="3100"/>
+            <w:shd w:fill="FFFFFF" w:color="auto" w:val="clear"/>
+            <w:tcMar>
+              <w:top w:type="dxa" w:w="70"/>
+              <w:left w:type="dxa" w:w="100"/>
+              <w:bottom w:type="dxa" w:w="70"/>
+              <w:right w:type="dxa" w:w="100"/>
+            </w:tcMar>
+          </w:tcPr>
+          <w:p>
+            <w:pPr>
+              <w:spacing w:after="40"/>
+            </w:pPr>
+            <w:r>
+              <w:rPr>
+                <w:rFonts w:ascii="Calibri" w:cs="Calibri" w:eastAsia="Calibri" w:hAnsi="Calibri"/>
+                <w:b w:val="false"/>
+                <w:bCs w:val="false"/>
+                <w:color w:val="1F2A24"/>
+                <w:sz w:val="18"/>
+                <w:szCs w:val="18"/>
+              </w:rPr>
+              <w:t xml:space="preserve">The same rock under a canopy, an otter in the same crevice the sheephead passed.</w:t>
+            </w:r>
+          </w:p>
+        </w:tc>
+        <w:tc>
+          <w:tcPr>
+            <w:tcW w:type="dxa" w:w="2800"/>
+            <w:shd w:fill="FFFFFF" w:color="auto" w:val="clear"/>
+            <w:tcMar>
+              <w:top w:type="dxa" w:w="70"/>
+              <w:left w:type="dxa" w:w="100"/>
+              <w:bottom w:type="dxa" w:w="70"/>
+              <w:right w:type="dxa" w:w="100"/>
+            </w:tcMar>
+          </w:tcPr>
+          <w:p>
+            <w:pPr>
+              <w:spacing w:after="40"/>
+            </w:pPr>
+            <w:r>
+              <w:rPr>
+                <w:rFonts w:ascii="Calibri" w:cs="Calibri" w:eastAsia="Calibri" w:hAnsi="Calibri"/>
+                <w:b w:val="false"/>
+                <w:bCs w:val="false"/>
+                <w:color w:val="1F2A24"/>
+                <w:sz w:val="18"/>
+                <w:szCs w:val="18"/>
+              </w:rPr>
+              <w:t xml:space="preserve">The 2047 relapse hold; a few urchins still visible on the rock in 2100.</w:t>
+            </w:r>
+          </w:p>
+        </w:tc>
+      </w:tr>
+      <w:tr>
+        <w:tc>
+          <w:tcPr>
+            <w:tcW w:type="dxa" w:w="1100"/>
+            <w:shd w:fill="F1F5F2" w:color="auto" w:val="clear"/>
+            <w:tcMar>
+              <w:top w:type="dxa" w:w="70"/>
+              <w:left w:type="dxa" w:w="100"/>
+              <w:bottom w:type="dxa" w:w="70"/>
+              <w:right w:type="dxa" w:w="100"/>
+            </w:tcMar>
+          </w:tcPr>
+          <w:p>
+            <w:pPr>
+              <w:spacing w:after="40"/>
+            </w:pPr>
+            <w:r>
+              <w:rPr>
+                <w:rFonts w:ascii="Calibri" w:cs="Calibri" w:eastAsia="Calibri" w:hAnsi="Calibri"/>
+                <w:b w:val="false"/>
+                <w:bCs w:val="false"/>
+                <w:color w:val="1F2A24"/>
+                <w:sz w:val="18"/>
+                <w:szCs w:val="18"/>
+              </w:rPr>
+              <w:t xml:space="preserve">06</w:t>
+            </w:r>
+          </w:p>
+        </w:tc>
+        <w:tc>
+          <w:tcPr>
+            <w:tcW w:type="dxa" w:w="3100"/>
+            <w:shd w:fill="F1F5F2" w:color="auto" w:val="clear"/>
+            <w:tcMar>
+              <w:top w:type="dxa" w:w="70"/>
+              <w:left w:type="dxa" w:w="100"/>
+              <w:bottom w:type="dxa" w:w="70"/>
+              <w:right w:type="dxa" w:w="100"/>
+            </w:tcMar>
+          </w:tcPr>
+          <w:p>
+            <w:pPr>
+              <w:spacing w:after="40"/>
+            </w:pPr>
+            <w:r>
+              <w:rPr>
+                <w:rFonts w:ascii="Calibri" w:cs="Calibri" w:eastAsia="Calibri" w:hAnsi="Calibri"/>
+                <w:b w:val="false"/>
+                <w:bCs w:val="false"/>
+                <w:color w:val="1F2A24"/>
+                <w:sz w:val="18"/>
+                <w:szCs w:val="18"/>
+              </w:rPr>
+              <w:t xml:space="preserve">One hyaena with a wire scar at 02:40; an otherwise empty night.</w:t>
+            </w:r>
+          </w:p>
+        </w:tc>
+        <w:tc>
+          <w:tcPr>
+            <w:tcW w:type="dxa" w:w="3100"/>
+            <w:shd w:fill="F1F5F2" w:color="auto" w:val="clear"/>
+            <w:tcMar>
+              <w:top w:type="dxa" w:w="70"/>
+              <w:left w:type="dxa" w:w="100"/>
+              <w:bottom w:type="dxa" w:w="70"/>
+              <w:right w:type="dxa" w:w="100"/>
+            </w:tcMar>
+          </w:tcPr>
+          <w:p>
+            <w:pPr>
+              <w:spacing w:after="40"/>
+            </w:pPr>
+            <w:r>
+              <w:rPr>
+                <w:rFonts w:ascii="Calibri" w:cs="Calibri" w:eastAsia="Calibri" w:hAnsi="Calibri"/>
+                <w:b w:val="false"/>
+                <w:bCs w:val="false"/>
+                <w:color w:val="1F2A24"/>
+                <w:sz w:val="18"/>
+                <w:szCs w:val="18"/>
+              </w:rPr>
+              <w:t xml:space="preserve">The same pan, the same clock, never empty; a leopard at the same hour the lone hyaena came.</w:t>
+            </w:r>
+          </w:p>
+        </w:tc>
+        <w:tc>
+          <w:tcPr>
+            <w:tcW w:type="dxa" w:w="2800"/>
+            <w:shd w:fill="F1F5F2" w:color="auto" w:val="clear"/>
+            <w:tcMar>
+              <w:top w:type="dxa" w:w="70"/>
+              <w:left w:type="dxa" w:w="100"/>
+              <w:bottom w:type="dxa" w:w="70"/>
+              <w:right w:type="dxa" w:w="100"/>
+            </w:tcMar>
+          </w:tcPr>
+          <w:p>
+            <w:pPr>
+              <w:spacing w:after="40"/>
+            </w:pPr>
+            <w:r>
+              <w:rPr>
+                <w:rFonts w:ascii="Calibri" w:cs="Calibri" w:eastAsia="Calibri" w:hAnsi="Calibri"/>
+                <w:b w:val="false"/>
+                <w:bCs w:val="false"/>
+                <w:color w:val="1F2A24"/>
+                <w:sz w:val="18"/>
+                <w:szCs w:val="18"/>
+              </w:rPr>
+              <w:t xml:space="preserve">A snapped fence post at the pan's edge in both eras; the elephants jolt the camera.</w:t>
+            </w:r>
+          </w:p>
+        </w:tc>
+      </w:tr>
+      <w:tr>
+        <w:tc>
+          <w:tcPr>
+            <w:tcW w:type="dxa" w:w="1100"/>
+            <w:shd w:fill="FFFFFF" w:color="auto" w:val="clear"/>
+            <w:tcMar>
+              <w:top w:type="dxa" w:w="70"/>
+              <w:left w:type="dxa" w:w="100"/>
+              <w:bottom w:type="dxa" w:w="70"/>
+              <w:right w:type="dxa" w:w="100"/>
+            </w:tcMar>
+          </w:tcPr>
+          <w:p>
+            <w:pPr>
+              <w:spacing w:after="40"/>
+            </w:pPr>
+            <w:r>
+              <w:rPr>
+                <w:rFonts w:ascii="Calibri" w:cs="Calibri" w:eastAsia="Calibri" w:hAnsi="Calibri"/>
+                <w:b w:val="false"/>
+                <w:bCs w:val="false"/>
+                <w:color w:val="1F2A24"/>
+                <w:sz w:val="18"/>
+                <w:szCs w:val="18"/>
+              </w:rPr>
+              <w:t xml:space="preserve">07</w:t>
+            </w:r>
+          </w:p>
+        </w:tc>
+        <w:tc>
+          <w:tcPr>
+            <w:tcW w:type="dxa" w:w="3100"/>
+            <w:shd w:fill="FFFFFF" w:color="auto" w:val="clear"/>
+            <w:tcMar>
+              <w:top w:type="dxa" w:w="70"/>
+              <w:left w:type="dxa" w:w="100"/>
+              <w:bottom w:type="dxa" w:w="70"/>
+              <w:right w:type="dxa" w:w="100"/>
+            </w:tcMar>
+          </w:tcPr>
+          <w:p>
+            <w:pPr>
+              <w:spacing w:after="40"/>
+            </w:pPr>
+            <w:r>
+              <w:rPr>
+                <w:rFonts w:ascii="Calibri" w:cs="Calibri" w:eastAsia="Calibri" w:hAnsi="Calibri"/>
+                <w:b w:val="false"/>
+                <w:bCs w:val="false"/>
+                <w:color w:val="1F2A24"/>
+                <w:sz w:val="18"/>
+                <w:szCs w:val="18"/>
+              </w:rPr>
+              <w:t xml:space="preserve">A plastic sheet on the roots; mudskippers; a crow.</w:t>
+            </w:r>
+          </w:p>
+        </w:tc>
+        <w:tc>
+          <w:tcPr>
+            <w:tcW w:type="dxa" w:w="3100"/>
+            <w:shd w:fill="FFFFFF" w:color="auto" w:val="clear"/>
+            <w:tcMar>
+              <w:top w:type="dxa" w:w="70"/>
+              <w:left w:type="dxa" w:w="100"/>
+              <w:bottom w:type="dxa" w:w="70"/>
+              <w:right w:type="dxa" w:w="100"/>
+            </w:tcMar>
+          </w:tcPr>
+          <w:p>
+            <w:pPr>
+              <w:spacing w:after="40"/>
+            </w:pPr>
+            <w:r>
+              <w:rPr>
+                <w:rFonts w:ascii="Calibri" w:cs="Calibri" w:eastAsia="Calibri" w:hAnsi="Calibri"/>
+                <w:b w:val="false"/>
+                <w:bCs w:val="false"/>
+                <w:color w:val="1F2A24"/>
+                <w:sz w:val="18"/>
+                <w:szCs w:val="18"/>
+              </w:rPr>
+              <w:t xml:space="preserve">A fishing cat where the sheet was; a kingfisher where the crow was.</w:t>
+            </w:r>
+          </w:p>
+        </w:tc>
+        <w:tc>
+          <w:tcPr>
+            <w:tcW w:type="dxa" w:w="2800"/>
+            <w:shd w:fill="FFFFFF" w:color="auto" w:val="clear"/>
+            <w:tcMar>
+              <w:top w:type="dxa" w:w="70"/>
+              <w:left w:type="dxa" w:w="100"/>
+              <w:bottom w:type="dxa" w:w="70"/>
+              <w:right w:type="dxa" w:w="100"/>
+            </w:tcMar>
+          </w:tcPr>
+          <w:p>
+            <w:pPr>
+              <w:spacing w:after="40"/>
+            </w:pPr>
+            <w:r>
+              <w:rPr>
+                <w:rFonts w:ascii="Calibri" w:cs="Calibri" w:eastAsia="Calibri" w:hAnsi="Calibri"/>
+                <w:b w:val="false"/>
+                <w:bCs w:val="false"/>
+                <w:color w:val="1F2A24"/>
+                <w:sz w:val="18"/>
+                <w:szCs w:val="18"/>
+              </w:rPr>
+              <w:t xml:space="preserve">One bottle wedged in the roots in both eras.</w:t>
             </w:r>
           </w:p>
         </w:tc>
@@ -3732,6 +4713,521 @@
           <w:szCs w:val="21"/>
         </w:rPr>
         <w:t xml:space="preserve">The animal's behaviour is the final tell: in 2026 animals pass through fast and alone; in 2100 they linger, feed, bring young and inspect the camera.</w:t>
+      </w:r>
+    </w:p>
+    <w:p>
+      <w:pPr>
+        <w:pStyle w:val="Heading1"/>
+        <w:spacing w:after="140" w:before="360"/>
+      </w:pPr>
+      <w:r>
+        <w:rPr>
+          <w:rFonts w:ascii="Calibri" w:cs="Calibri" w:eastAsia="Calibri" w:hAnsi="Calibri"/>
+          <w:b/>
+          <w:bCs/>
+          <w:color w:val="1D6B4F"/>
+          <w:sz w:val="30"/>
+          <w:szCs w:val="30"/>
+        </w:rPr>
+        <w:t xml:space="preserve">▲ 5b. Why the film changes shape at 55 seconds</w:t>
+      </w:r>
+    </w:p>
+    <w:p>
+      <w:pPr>
+        <w:spacing w:after="100" w:before="0"/>
+      </w:pPr>
+      <w:r>
+        <w:rPr>
+          <w:rFonts w:ascii="Calibri" w:cs="Calibri" w:eastAsia="Calibri" w:hAnsi="Calibri"/>
+          <w:color w:val="1F2A24"/>
+          <w:sz w:val="21"/>
+          <w:szCs w:val="21"/>
+        </w:rPr>
+        <w:t xml:space="preserve">Four pairs teach the audience the rule: a quiet 2026 frame, a flash, a fuller 2100 frame. By the fifth pair the rule is known and every further pair is confirmation; the energy drains exactly where the film should be climbing. The second half keeps the camera-trap language but changes what the timestamp and the camera are allowed to do, one new idea per station:</w:t>
+      </w:r>
+    </w:p>
+    <w:tbl>
+      <w:tblPr>
+        <w:tblW w:type="dxa" w:w="10100"/>
+        <w:tblBorders>
+          <w:top w:val="single" w:color="C9D3CD" w:sz="4"/>
+          <w:left w:val="single" w:color="C9D3CD" w:sz="4"/>
+          <w:bottom w:val="single" w:color="C9D3CD" w:sz="4"/>
+          <w:right w:val="single" w:color="C9D3CD" w:sz="4"/>
+          <w:insideH w:val="single" w:color="C9D3CD" w:sz="4"/>
+          <w:insideV w:val="single" w:color="C9D3CD" w:sz="4"/>
+        </w:tblBorders>
+      </w:tblPr>
+      <w:tblGrid>
+        <w:gridCol w:w="2300"/>
+        <w:gridCol w:w="3900"/>
+        <w:gridCol w:w="3900"/>
+      </w:tblGrid>
+      <w:tr>
+        <w:trPr>
+          <w:tblHeader/>
+        </w:trPr>
+        <w:tc>
+          <w:tcPr>
+            <w:tcW w:type="dxa" w:w="2300"/>
+            <w:shd w:fill="1D6B4F" w:color="auto" w:val="clear"/>
+            <w:tcMar>
+              <w:top w:type="dxa" w:w="70"/>
+              <w:left w:type="dxa" w:w="100"/>
+              <w:bottom w:type="dxa" w:w="70"/>
+              <w:right w:type="dxa" w:w="100"/>
+            </w:tcMar>
+          </w:tcPr>
+          <w:p>
+            <w:pPr>
+              <w:spacing w:after="40"/>
+            </w:pPr>
+            <w:r>
+              <w:rPr>
+                <w:rFonts w:ascii="Calibri" w:cs="Calibri" w:eastAsia="Calibri" w:hAnsi="Calibri"/>
+                <w:b/>
+                <w:bCs/>
+                <w:color w:val="FFFFFF"/>
+                <w:sz w:val="19"/>
+                <w:szCs w:val="19"/>
+              </w:rPr>
+              <w:t xml:space="preserve">Station</w:t>
+            </w:r>
+          </w:p>
+        </w:tc>
+        <w:tc>
+          <w:tcPr>
+            <w:tcW w:type="dxa" w:w="3900"/>
+            <w:shd w:fill="1D6B4F" w:color="auto" w:val="clear"/>
+            <w:tcMar>
+              <w:top w:type="dxa" w:w="70"/>
+              <w:left w:type="dxa" w:w="100"/>
+              <w:bottom w:type="dxa" w:w="70"/>
+              <w:right w:type="dxa" w:w="100"/>
+            </w:tcMar>
+          </w:tcPr>
+          <w:p>
+            <w:pPr>
+              <w:spacing w:after="40"/>
+            </w:pPr>
+            <w:r>
+              <w:rPr>
+                <w:rFonts w:ascii="Calibri" w:cs="Calibri" w:eastAsia="Calibri" w:hAnsi="Calibri"/>
+                <w:b/>
+                <w:bCs/>
+                <w:color w:val="FFFFFF"/>
+                <w:sz w:val="19"/>
+                <w:szCs w:val="19"/>
+              </w:rPr>
+              <w:t xml:space="preserve">The new move</w:t>
+            </w:r>
+          </w:p>
+        </w:tc>
+        <w:tc>
+          <w:tcPr>
+            <w:tcW w:type="dxa" w:w="3900"/>
+            <w:shd w:fill="1D6B4F" w:color="auto" w:val="clear"/>
+            <w:tcMar>
+              <w:top w:type="dxa" w:w="70"/>
+              <w:left w:type="dxa" w:w="100"/>
+              <w:bottom w:type="dxa" w:w="70"/>
+              <w:right w:type="dxa" w:w="100"/>
+            </w:tcMar>
+          </w:tcPr>
+          <w:p>
+            <w:pPr>
+              <w:spacing w:after="40"/>
+            </w:pPr>
+            <w:r>
+              <w:rPr>
+                <w:rFonts w:ascii="Calibri" w:cs="Calibri" w:eastAsia="Calibri" w:hAnsi="Calibri"/>
+                <w:b/>
+                <w:bCs/>
+                <w:color w:val="FFFFFF"/>
+                <w:sz w:val="19"/>
+                <w:szCs w:val="19"/>
+              </w:rPr>
+              <w:t xml:space="preserve">What it buys</w:t>
+            </w:r>
+          </w:p>
+        </w:tc>
+      </w:tr>
+      <w:tr>
+        <w:tc>
+          <w:tcPr>
+            <w:tcW w:type="dxa" w:w="2300"/>
+            <w:shd w:fill="FFFFFF" w:color="auto" w:val="clear"/>
+            <w:tcMar>
+              <w:top w:type="dxa" w:w="70"/>
+              <w:left w:type="dxa" w:w="100"/>
+              <w:bottom w:type="dxa" w:w="70"/>
+              <w:right w:type="dxa" w:w="100"/>
+            </w:tcMar>
+          </w:tcPr>
+          <w:p>
+            <w:pPr>
+              <w:spacing w:after="40"/>
+            </w:pPr>
+            <w:r>
+              <w:rPr>
+                <w:rFonts w:ascii="Calibri" w:cs="Calibri" w:eastAsia="Calibri" w:hAnsi="Calibri"/>
+                <w:b w:val="false"/>
+                <w:bCs w:val="false"/>
+                <w:color w:val="1F2A24"/>
+                <w:sz w:val="18"/>
+                <w:szCs w:val="18"/>
+              </w:rPr>
+              <w:t xml:space="preserve">05 · The long watch</w:t>
+            </w:r>
+          </w:p>
+        </w:tc>
+        <w:tc>
+          <w:tcPr>
+            <w:tcW w:type="dxa" w:w="3900"/>
+            <w:shd w:fill="FFFFFF" w:color="auto" w:val="clear"/>
+            <w:tcMar>
+              <w:top w:type="dxa" w:w="70"/>
+              <w:left w:type="dxa" w:w="100"/>
+              <w:bottom w:type="dxa" w:w="70"/>
+              <w:right w:type="dxa" w:w="100"/>
+            </w:tcMar>
+          </w:tcPr>
+          <w:p>
+            <w:pPr>
+              <w:spacing w:after="40"/>
+            </w:pPr>
+            <w:r>
+              <w:rPr>
+                <w:rFonts w:ascii="Calibri" w:cs="Calibri" w:eastAsia="Calibri" w:hAnsi="Calibri"/>
+                <w:b w:val="false"/>
+                <w:bCs w:val="false"/>
+                <w:color w:val="1F2A24"/>
+                <w:sz w:val="18"/>
+                <w:szCs w:val="18"/>
+              </w:rPr>
+              <w:t xml:space="preserve">One frame; the year digit runs 2026 → 2100 while the reef regrows, with a relapse year.</w:t>
+            </w:r>
+          </w:p>
+        </w:tc>
+        <w:tc>
+          <w:tcPr>
+            <w:tcW w:type="dxa" w:w="3900"/>
+            <w:shd w:fill="FFFFFF" w:color="auto" w:val="clear"/>
+            <w:tcMar>
+              <w:top w:type="dxa" w:w="70"/>
+              <w:left w:type="dxa" w:w="100"/>
+              <w:bottom w:type="dxa" w:w="70"/>
+              <w:right w:type="dxa" w:w="100"/>
+            </w:tcMar>
+          </w:tcPr>
+          <w:p>
+            <w:pPr>
+              <w:spacing w:after="40"/>
+            </w:pPr>
+            <w:r>
+              <w:rPr>
+                <w:rFonts w:ascii="Calibri" w:cs="Calibri" w:eastAsia="Calibri" w:hAnsi="Calibri"/>
+                <w:b w:val="false"/>
+                <w:bCs w:val="false"/>
+                <w:color w:val="1F2A24"/>
+                <w:sz w:val="18"/>
+                <w:szCs w:val="18"/>
+              </w:rPr>
+              <w:t xml:space="preserve">Shows recovery as a process with a setback. The audience watches 74 years happen rather than being told they did.</w:t>
+            </w:r>
+          </w:p>
+        </w:tc>
+      </w:tr>
+      <w:tr>
+        <w:tc>
+          <w:tcPr>
+            <w:tcW w:type="dxa" w:w="2300"/>
+            <w:shd w:fill="F1F5F2" w:color="auto" w:val="clear"/>
+            <w:tcMar>
+              <w:top w:type="dxa" w:w="70"/>
+              <w:left w:type="dxa" w:w="100"/>
+              <w:bottom w:type="dxa" w:w="70"/>
+              <w:right w:type="dxa" w:w="100"/>
+            </w:tcMar>
+          </w:tcPr>
+          <w:p>
+            <w:pPr>
+              <w:spacing w:after="40"/>
+            </w:pPr>
+            <w:r>
+              <w:rPr>
+                <w:rFonts w:ascii="Calibri" w:cs="Calibri" w:eastAsia="Calibri" w:hAnsi="Calibri"/>
+                <w:b w:val="false"/>
+                <w:bCs w:val="false"/>
+                <w:color w:val="1F2A24"/>
+                <w:sz w:val="18"/>
+                <w:szCs w:val="18"/>
+              </w:rPr>
+              <w:t xml:space="preserve">06 · One night</w:t>
+            </w:r>
+          </w:p>
+        </w:tc>
+        <w:tc>
+          <w:tcPr>
+            <w:tcW w:type="dxa" w:w="3900"/>
+            <w:shd w:fill="F1F5F2" w:color="auto" w:val="clear"/>
+            <w:tcMar>
+              <w:top w:type="dxa" w:w="70"/>
+              <w:left w:type="dxa" w:w="100"/>
+              <w:bottom w:type="dxa" w:w="70"/>
+              <w:right w:type="dxa" w:w="100"/>
+            </w:tcMar>
+          </w:tcPr>
+          <w:p>
+            <w:pPr>
+              <w:spacing w:after="40"/>
+            </w:pPr>
+            <w:r>
+              <w:rPr>
+                <w:rFonts w:ascii="Calibri" w:cs="Calibri" w:eastAsia="Calibri" w:hAnsi="Calibri"/>
+                <w:b w:val="false"/>
+                <w:bCs w:val="false"/>
+                <w:color w:val="1F2A24"/>
+                <w:sz w:val="18"/>
+                <w:szCs w:val="18"/>
+              </w:rPr>
+              <w:t xml:space="preserve">A whole night per era, fast-forwarded, the clock visible in the stamp.</w:t>
+            </w:r>
+          </w:p>
+        </w:tc>
+        <w:tc>
+          <w:tcPr>
+            <w:tcW w:type="dxa" w:w="3900"/>
+            <w:shd w:fill="F1F5F2" w:color="auto" w:val="clear"/>
+            <w:tcMar>
+              <w:top w:type="dxa" w:w="70"/>
+              <w:left w:type="dxa" w:w="100"/>
+              <w:bottom w:type="dxa" w:w="70"/>
+              <w:right w:type="dxa" w:w="100"/>
+            </w:tcMar>
+          </w:tcPr>
+          <w:p>
+            <w:pPr>
+              <w:spacing w:after="40"/>
+            </w:pPr>
+            <w:r>
+              <w:rPr>
+                <w:rFonts w:ascii="Calibri" w:cs="Calibri" w:eastAsia="Calibri" w:hAnsi="Calibri"/>
+                <w:b w:val="false"/>
+                <w:bCs w:val="false"/>
+                <w:color w:val="1F2A24"/>
+                <w:sz w:val="18"/>
+                <w:szCs w:val="18"/>
+              </w:rPr>
+              <w:t xml:space="preserve">Turns presence into throughput. 2026 is not empty of life, it is thin; 2100 is crowded. Density is the jaw-drop.</w:t>
+            </w:r>
+          </w:p>
+        </w:tc>
+      </w:tr>
+      <w:tr>
+        <w:tc>
+          <w:tcPr>
+            <w:tcW w:type="dxa" w:w="2300"/>
+            <w:shd w:fill="FFFFFF" w:color="auto" w:val="clear"/>
+            <w:tcMar>
+              <w:top w:type="dxa" w:w="70"/>
+              <w:left w:type="dxa" w:w="100"/>
+              <w:bottom w:type="dxa" w:w="70"/>
+              <w:right w:type="dxa" w:w="100"/>
+            </w:tcMar>
+          </w:tcPr>
+          <w:p>
+            <w:pPr>
+              <w:spacing w:after="40"/>
+            </w:pPr>
+            <w:r>
+              <w:rPr>
+                <w:rFonts w:ascii="Calibri" w:cs="Calibri" w:eastAsia="Calibri" w:hAnsi="Calibri"/>
+                <w:b w:val="false"/>
+                <w:bCs w:val="false"/>
+                <w:color w:val="1F2A24"/>
+                <w:sz w:val="18"/>
+                <w:szCs w:val="18"/>
+              </w:rPr>
+              <w:t xml:space="preserve">07 · The look</w:t>
+            </w:r>
+          </w:p>
+        </w:tc>
+        <w:tc>
+          <w:tcPr>
+            <w:tcW w:type="dxa" w:w="3900"/>
+            <w:shd w:fill="FFFFFF" w:color="auto" w:val="clear"/>
+            <w:tcMar>
+              <w:top w:type="dxa" w:w="70"/>
+              <w:left w:type="dxa" w:w="100"/>
+              <w:bottom w:type="dxa" w:w="70"/>
+              <w:right w:type="dxa" w:w="100"/>
+            </w:tcMar>
+          </w:tcPr>
+          <w:p>
+            <w:pPr>
+              <w:spacing w:after="40"/>
+            </w:pPr>
+            <w:r>
+              <w:rPr>
+                <w:rFonts w:ascii="Calibri" w:cs="Calibri" w:eastAsia="Calibri" w:hAnsi="Calibri"/>
+                <w:b w:val="false"/>
+                <w:bCs w:val="false"/>
+                <w:color w:val="1F2A24"/>
+                <w:sz w:val="18"/>
+                <w:szCs w:val="18"/>
+              </w:rPr>
+              <w:t xml:space="preserve">The camera itself is seen (in the cat's eye), then knocked down, then perched on.</w:t>
+            </w:r>
+          </w:p>
+        </w:tc>
+        <w:tc>
+          <w:tcPr>
+            <w:tcW w:type="dxa" w:w="3900"/>
+            <w:shd w:fill="FFFFFF" w:color="auto" w:val="clear"/>
+            <w:tcMar>
+              <w:top w:type="dxa" w:w="70"/>
+              <w:left w:type="dxa" w:w="100"/>
+              <w:bottom w:type="dxa" w:w="70"/>
+              <w:right w:type="dxa" w:w="100"/>
+            </w:tcMar>
+          </w:tcPr>
+          <w:p>
+            <w:pPr>
+              <w:spacing w:after="40"/>
+            </w:pPr>
+            <w:r>
+              <w:rPr>
+                <w:rFonts w:ascii="Calibri" w:cs="Calibri" w:eastAsia="Calibri" w:hAnsi="Calibri"/>
+                <w:b w:val="false"/>
+                <w:bCs w:val="false"/>
+                <w:color w:val="1F2A24"/>
+                <w:sz w:val="18"/>
+                <w:szCs w:val="18"/>
+              </w:rPr>
+              <w:t xml:space="preserve">The film's only glimpse of anything human is a camera reflected in an animal's eye; the animals then take the camera over. It ends the device instead of just stopping it.</w:t>
+            </w:r>
+          </w:p>
+        </w:tc>
+      </w:tr>
+      <w:tr>
+        <w:tc>
+          <w:tcPr>
+            <w:tcW w:type="dxa" w:w="2300"/>
+            <w:shd w:fill="F1F5F2" w:color="auto" w:val="clear"/>
+            <w:tcMar>
+              <w:top w:type="dxa" w:w="70"/>
+              <w:left w:type="dxa" w:w="100"/>
+              <w:bottom w:type="dxa" w:w="70"/>
+              <w:right w:type="dxa" w:w="100"/>
+            </w:tcMar>
+          </w:tcPr>
+          <w:p>
+            <w:pPr>
+              <w:spacing w:after="40"/>
+            </w:pPr>
+            <w:r>
+              <w:rPr>
+                <w:rFonts w:ascii="Calibri" w:cs="Calibri" w:eastAsia="Calibri" w:hAnsi="Calibri"/>
+                <w:b w:val="false"/>
+                <w:bCs w:val="false"/>
+                <w:color w:val="1F2A24"/>
+                <w:sz w:val="18"/>
+                <w:szCs w:val="18"/>
+              </w:rPr>
+              <w:t xml:space="preserve">The register</w:t>
+            </w:r>
+          </w:p>
+        </w:tc>
+        <w:tc>
+          <w:tcPr>
+            <w:tcW w:type="dxa" w:w="3900"/>
+            <w:shd w:fill="F1F5F2" w:color="auto" w:val="clear"/>
+            <w:tcMar>
+              <w:top w:type="dxa" w:w="70"/>
+              <w:left w:type="dxa" w:w="100"/>
+              <w:bottom w:type="dxa" w:w="70"/>
+              <w:right w:type="dxa" w:w="100"/>
+            </w:tcMar>
+          </w:tcPr>
+          <w:p>
+            <w:pPr>
+              <w:spacing w:after="40"/>
+            </w:pPr>
+            <w:r>
+              <w:rPr>
+                <w:rFonts w:ascii="Calibri" w:cs="Calibri" w:eastAsia="Calibri" w:hAnsi="Calibri"/>
+                <w:b w:val="false"/>
+                <w:bCs w:val="false"/>
+                <w:color w:val="1F2A24"/>
+                <w:sz w:val="18"/>
+                <w:szCs w:val="18"/>
+              </w:rPr>
+              <w:t xml:space="preserve">A monitoring wall of all seven 2100 frames and the film's own species tally.</w:t>
+            </w:r>
+          </w:p>
+        </w:tc>
+        <w:tc>
+          <w:tcPr>
+            <w:tcW w:type="dxa" w:w="3900"/>
+            <w:shd w:fill="F1F5F2" w:color="auto" w:val="clear"/>
+            <w:tcMar>
+              <w:top w:type="dxa" w:w="70"/>
+              <w:left w:type="dxa" w:w="100"/>
+              <w:bottom w:type="dxa" w:w="70"/>
+              <w:right w:type="dxa" w:w="100"/>
+            </w:tcMar>
+          </w:tcPr>
+          <w:p>
+            <w:pPr>
+              <w:spacing w:after="40"/>
+            </w:pPr>
+            <w:r>
+              <w:rPr>
+                <w:rFonts w:ascii="Calibri" w:cs="Calibri" w:eastAsia="Calibri" w:hAnsi="Calibri"/>
+                <w:b w:val="false"/>
+                <w:bCs w:val="false"/>
+                <w:color w:val="1F2A24"/>
+                <w:sz w:val="18"/>
+                <w:szCs w:val="18"/>
+              </w:rPr>
+              <w:t xml:space="preserve">A closing image that is a count, not a slogan; it rewards anyone who was keeping score.</w:t>
+            </w:r>
+          </w:p>
+        </w:tc>
+      </w:tr>
+    </w:tbl>
+    <w:p>
+      <w:pPr>
+        <w:pBdr>
+          <w:top w:val="single" w:color="1D6B4F" w:sz="6"/>
+          <w:bottom w:val="single" w:color="1D6B4F" w:sz="6"/>
+          <w:left w:val="single" w:color="1D6B4F" w:sz="6"/>
+          <w:right w:val="single" w:color="1D6B4F" w:sz="6"/>
+        </w:pBdr>
+        <w:shd w:fill="F1F5F2" w:color="auto" w:val="clear"/>
+        <w:spacing w:after="120" w:before="0"/>
+        <w:ind w:left="200" w:right="200"/>
+      </w:pPr>
+      <w:r>
+        <w:rPr>
+          <w:rFonts w:ascii="Calibri" w:cs="Calibri" w:eastAsia="Calibri" w:hAnsi="Calibri"/>
+          <w:b/>
+          <w:bCs/>
+          <w:color w:val="1F2A24"/>
+          <w:sz w:val="21"/>
+          <w:szCs w:val="21"/>
+        </w:rPr>
+        <w:t xml:space="preserve">Optional refinements before 55 s (only if cheap). </w:t>
+      </w:r>
+      <w:r>
+        <w:rPr>
+          <w:rFonts w:ascii="Calibri" w:cs="Calibri" w:eastAsia="Calibri" w:hAnsi="Calibri"/>
+          <w:color w:val="1F2A24"/>
+          <w:sz w:val="21"/>
+          <w:szCs w:val="21"/>
+        </w:rPr>
+        <w:t xml:space="preserve">(a) Station 03: let the sealed hole stay in frame beside the bricks, so the rhyme in the alignment table is visible. (b) Station 04: a rusted culvert ring in the far background of both eras gives the stream its kept imperfection. (c) Confirm the stamp temperature steps +1 to +2 °C at every station; it is the one tell that runs across all seven. Nothing else in the first four stations needs touching.</w:t>
       </w:r>
     </w:p>
     <w:p>
@@ -4481,7 +5977,7 @@
                 <w:sz w:val="18"/>
                 <w:szCs w:val="18"/>
               </w:rPr>
-              <w:t xml:space="preserve">55–67 s</w:t>
+              <w:t xml:space="preserve">▲ 55–69 s</w:t>
             </w:r>
           </w:p>
         </w:tc>
@@ -4509,7 +6005,7 @@
                 <w:sz w:val="18"/>
                 <w:szCs w:val="18"/>
               </w:rPr>
-              <w:t xml:space="preserve">Station 05, both clips.</w:t>
+              <w:t xml:space="preserve">Station 05, one frame. The year ticks 2026 → 2100 with six holds; the reef regrows, relapses in 2047, recovers. No IR flash in this station: the stamp itself is the cut.</w:t>
             </w:r>
           </w:p>
         </w:tc>
@@ -4537,7 +6033,7 @@
                 <w:sz w:val="18"/>
                 <w:szCs w:val="18"/>
               </w:rPr>
-              <w:t xml:space="preserve">log: rock and spines. · log: a forest that floats.</w:t>
+              <w:t xml:space="preserve">log (on the 2026 hold): rock and spines. · log (on the 2047 hold): a bad year. · log (on 2100): a forest that floats.</w:t>
             </w:r>
           </w:p>
         </w:tc>
@@ -4565,7 +6061,7 @@
                 <w:sz w:val="18"/>
                 <w:szCs w:val="18"/>
               </w:rPr>
-              <w:t xml:space="preserve">Kelp creak, otter exhale at the surface, urchin crunch.</w:t>
+              <w:t xml:space="preserve">A single sustained underwater tone; each year-tick is a soft shutter click; on the 2047 hold the tone drops a semitone and urchin crunch returns; otter exhale at the surface on 2083.</w:t>
             </w:r>
           </w:p>
         </w:tc>
@@ -4595,7 +6091,7 @@
                 <w:sz w:val="18"/>
                 <w:szCs w:val="18"/>
               </w:rPr>
-              <w:t xml:space="preserve">67–81 s</w:t>
+              <w:t xml:space="preserve">▲ 69–83 s</w:t>
             </w:r>
           </w:p>
         </w:tc>
@@ -4623,7 +6119,7 @@
                 <w:sz w:val="18"/>
                 <w:szCs w:val="18"/>
               </w:rPr>
-              <w:t xml:space="preserve">Station 06, both clips.</w:t>
+              <w:t xml:space="preserve">Station 06, one night per era at speed. The 2026 night: empty, one hyaena at 02:40. IR flash. The 2100 night: continuous traffic through to the same dawn.</w:t>
             </w:r>
           </w:p>
         </w:tc>
@@ -4651,7 +6147,7 @@
                 <w:sz w:val="18"/>
                 <w:szCs w:val="18"/>
               </w:rPr>
-              <w:t xml:space="preserve">log: one. scarred. · log: a clan, a lion, and whoever that was.</w:t>
+              <w:t xml:space="preserve">log (2026 dawn): one came. · log (2100 dawn): we stopped counting at the leopard.</w:t>
             </w:r>
           </w:p>
         </w:tc>
@@ -4679,7 +6175,7 @@
                 <w:sz w:val="18"/>
                 <w:szCs w:val="18"/>
               </w:rPr>
-              <w:t xml:space="preserve">Dusk birds, hyaena whoop, lion huff, elephant rumble under everything.</w:t>
+              <w:t xml:space="preserve">The clock's tick as a pulse under both nights; 2026 carries wind and one whoop; 2100 layers hyaena, lion huff, elephant rumble, impala snort, leopard rasp, then the same dawn birds as 2026.</w:t>
             </w:r>
           </w:p>
         </w:tc>
@@ -4709,7 +6205,7 @@
                 <w:sz w:val="18"/>
                 <w:szCs w:val="18"/>
               </w:rPr>
-              <w:t xml:space="preserve">81–94 s</w:t>
+              <w:t xml:space="preserve">▲ 83–95 s</w:t>
             </w:r>
           </w:p>
         </w:tc>
@@ -4737,7 +6233,7 @@
                 <w:sz w:val="18"/>
                 <w:szCs w:val="18"/>
               </w:rPr>
-              <w:t xml:space="preserve">Station 07, both clips. The fishing cat ends it with its face in the lens.</w:t>
+              <w:t xml:space="preserve">Station 07. 2026 clip as cut. IR flash. 2100: the cat hunts, walks to the lens, one eye fills the frame with the camera reflected in it; she shoulders the housing; the frame falls and settles looking up; a kingfisher lands on the lens hood.</w:t>
             </w:r>
           </w:p>
         </w:tc>
@@ -4765,7 +6261,7 @@
                 <w:sz w:val="18"/>
                 <w:szCs w:val="18"/>
               </w:rPr>
-              <w:t xml:space="preserve">log: tide, plastic, crows. · log: she knows exactly where the camera is.</w:t>
+              <w:t xml:space="preserve">log (2026): tide, plastic, crows. · log (as the eye fills the frame): she knows exactly where the camera is. · log (kingfisher on the housing): fine. it's yours now.</w:t>
             </w:r>
           </w:p>
         </w:tc>
@@ -4793,7 +6289,7 @@
                 <w:sz w:val="18"/>
                 <w:szCs w:val="18"/>
               </w:rPr>
-              <w:t xml:space="preserve">Water lapping, mudskipper flicks, the cat's wet strike.</w:t>
+              <w:t xml:space="preserve">Water, mudskipper flicks, the wet strike; a close scrape as the housing is shoved; mud settle; wingbeat and the kingfisher's call; the camera's own hum stops.</w:t>
             </w:r>
           </w:p>
         </w:tc>
@@ -4823,7 +6319,7 @@
                 <w:sz w:val="18"/>
                 <w:szCs w:val="18"/>
               </w:rPr>
-              <w:t xml:space="preserve">94–100 s</w:t>
+              <w:t xml:space="preserve">▲ 95–100 s</w:t>
             </w:r>
           </w:p>
         </w:tc>
@@ -4851,7 +6347,7 @@
                 <w:sz w:val="18"/>
                 <w:szCs w:val="18"/>
               </w:rPr>
-              <w:t xml:space="preserve">Black. Last frame of the cat held as a freeze, slowly losing the timestamp.</w:t>
+              <w:t xml:space="preserve">THE REGISTER: a monitoring wall, seven tiles, each station's last 2100 frame playing, every stamp reading 2100. Under it the film's own tally types out. Then title.</w:t>
             </w:r>
           </w:p>
         </w:tc>
@@ -4879,7 +6375,7 @@
                 <w:sz w:val="18"/>
                 <w:szCs w:val="18"/>
               </w:rPr>
-              <w:t xml:space="preserve">END CARD: Seven of these stations exist today. The 2100 clips show one outcome the evidence allows, if the work continues. — then title and credits.</w:t>
+              <w:t xml:space="preserve">register: 7 stations · species seen in 2026: 11 · species seen in 2100: 31 — then — these seven places exist. the 2100 frames are one outcome the evidence allows, if the work holds. — then MOTION DETECTED: 2100.</w:t>
             </w:r>
           </w:p>
         </w:tc>
@@ -4907,7 +6403,7 @@
                 <w:sz w:val="18"/>
                 <w:szCs w:val="18"/>
               </w:rPr>
-              <w:t xml:space="preserve">All seven stations' ambiences layered quietly, then cut to silence on the title.</w:t>
+              <w:t xml:space="preserve">All seven ambiences at once, quiet, then cut to silence on the title.</w:t>
             </w:r>
           </w:p>
         </w:tc>
@@ -4965,7 +6461,64 @@
           <w:sz w:val="21"/>
           <w:szCs w:val="21"/>
         </w:rPr>
-        <w:t xml:space="preserve">The cut between eras always happens on the trap's infrared burst, so the switch feels like the camera re-triggering rather than an edit.</w:t>
+        <w:t xml:space="preserve">In stations 01–04, 06 and 07 the cut between eras happens on the trap's infrared burst, so the switch feels like the camera re-triggering rather than an edit. Station 05 has no burst: its year ticker is the cut.</w:t>
+      </w:r>
+    </w:p>
+    <w:p>
+      <w:pPr>
+        <w:pStyle w:val="ListParagraph"/>
+        <w:numPr>
+          <w:ilvl w:val="0"/>
+          <w:numId w:val="2"/>
+        </w:numPr>
+        <w:spacing w:after="60" w:before="0"/>
+      </w:pPr>
+      <w:r>
+        <w:rPr>
+          <w:rFonts w:ascii="Calibri" w:cs="Calibri" w:eastAsia="Calibri" w:hAnsi="Calibri"/>
+          <w:color w:val="1F2A24"/>
+          <w:sz w:val="21"/>
+          <w:szCs w:val="21"/>
+        </w:rPr>
+        <w:t xml:space="preserve">▲ The second half must not repeat the first half's rhythm. After four pairs the audience has learned the trick; stations 05 and 06 each change what the timestamp does (it runs through years; it runs through a night), and station 07 changes what the camera does (it falls).</w:t>
+      </w:r>
+    </w:p>
+    <w:p>
+      <w:pPr>
+        <w:pStyle w:val="ListParagraph"/>
+        <w:numPr>
+          <w:ilvl w:val="0"/>
+          <w:numId w:val="2"/>
+        </w:numPr>
+        <w:spacing w:after="60" w:before="0"/>
+      </w:pPr>
+      <w:r>
+        <w:rPr>
+          <w:rFonts w:ascii="Calibri" w:cs="Calibri" w:eastAsia="Calibri" w:hAnsi="Calibri"/>
+          <w:color w:val="1F2A24"/>
+          <w:sz w:val="21"/>
+          <w:szCs w:val="21"/>
+        </w:rPr>
+        <w:t xml:space="preserve">▲ The year ticker in station 05 is readable or it fails: year digits at least 4% of frame height, each hold at least 0.8 s, the fast ticks at 8 per second, never faster.</w:t>
+      </w:r>
+    </w:p>
+    <w:p>
+      <w:pPr>
+        <w:pStyle w:val="ListParagraph"/>
+        <w:numPr>
+          <w:ilvl w:val="0"/>
+          <w:numId w:val="2"/>
+        </w:numPr>
+        <w:spacing w:after="60" w:before="0"/>
+      </w:pPr>
+      <w:r>
+        <w:rPr>
+          <w:rFonts w:ascii="Calibri" w:cs="Calibri" w:eastAsia="Calibri" w:hAnsi="Calibri"/>
+          <w:color w:val="1F2A24"/>
+          <w:sz w:val="21"/>
+          <w:szCs w:val="21"/>
+        </w:rPr>
+        <w:t xml:space="preserve">▲ The fast-forwarded nights in station 06 keep the stamp's clock legible (hours advancing about one per second) and keep every animal's motion natural inside its own moments: animals move at real speed, the sky and the clock move fast. Cut between real-time moments with hard cuts, never speed-ramp the animals.</w:t>
       </w:r>
     </w:p>
     <w:p>
@@ -8577,6 +10130,82 @@
           <w:sz w:val="21"/>
           <w:szCs w:val="21"/>
         </w:rPr>
+        <w:t xml:space="preserve">▲ Station 05: read every held year aloud from a phone at arm's length; confirm the 2047 relapse is unmistakable (canopy visibly thinner than 2034's growth, urchins back).</w:t>
+      </w:r>
+    </w:p>
+    <w:p>
+      <w:pPr>
+        <w:pStyle w:val="ListParagraph"/>
+        <w:numPr>
+          <w:ilvl w:val="0"/>
+          <w:numId w:val="2"/>
+        </w:numPr>
+        <w:spacing w:after="60" w:before="0"/>
+      </w:pPr>
+      <w:r>
+        <w:rPr>
+          <w:rFonts w:ascii="Calibri" w:cs="Calibri" w:eastAsia="Calibri" w:hAnsi="Calibri"/>
+          <w:color w:val="1F2A24"/>
+          <w:sz w:val="21"/>
+          <w:szCs w:val="21"/>
+        </w:rPr>
+        <w:t xml:space="preserve">▲ Station 06: confirm the stamp clock advances at the same rate in both nights and that the 02:40 lone hyaena and the 04:00 leopard occupy the same patch of frame.</w:t>
+      </w:r>
+    </w:p>
+    <w:p>
+      <w:pPr>
+        <w:pStyle w:val="ListParagraph"/>
+        <w:numPr>
+          <w:ilvl w:val="0"/>
+          <w:numId w:val="2"/>
+        </w:numPr>
+        <w:spacing w:after="60" w:before="0"/>
+      </w:pPr>
+      <w:r>
+        <w:rPr>
+          <w:rFonts w:ascii="Calibri" w:cs="Calibri" w:eastAsia="Calibri" w:hAnsi="Calibri"/>
+          <w:color w:val="1F2A24"/>
+          <w:sz w:val="21"/>
+          <w:szCs w:val="21"/>
+        </w:rPr>
+        <w:t xml:space="preserve">▲ Station 07: the reflection in the cat's eye must show a camera housing and nothing else; no face, hand or silhouette. After the fall, the horizon tilt must match a housing lying on its side in mud.</w:t>
+      </w:r>
+    </w:p>
+    <w:p>
+      <w:pPr>
+        <w:pStyle w:val="ListParagraph"/>
+        <w:numPr>
+          <w:ilvl w:val="0"/>
+          <w:numId w:val="2"/>
+        </w:numPr>
+        <w:spacing w:after="60" w:before="0"/>
+      </w:pPr>
+      <w:r>
+        <w:rPr>
+          <w:rFonts w:ascii="Calibri" w:cs="Calibri" w:eastAsia="Calibri" w:hAnsi="Calibri"/>
+          <w:color w:val="1F2A24"/>
+          <w:sz w:val="21"/>
+          <w:szCs w:val="21"/>
+        </w:rPr>
+        <w:t xml:space="preserve">▲ The register's species counts are counted from the cut itself, by two people independently, and match; they are the film's own tally, not a statistic about the world, and the end card says so.</w:t>
+      </w:r>
+    </w:p>
+    <w:p>
+      <w:pPr>
+        <w:pStyle w:val="ListParagraph"/>
+        <w:numPr>
+          <w:ilvl w:val="0"/>
+          <w:numId w:val="2"/>
+        </w:numPr>
+        <w:spacing w:after="60" w:before="0"/>
+      </w:pPr>
+      <w:r>
+        <w:rPr>
+          <w:rFonts w:ascii="Calibri" w:cs="Calibri" w:eastAsia="Calibri" w:hAnsi="Calibri"/>
+          <w:color w:val="1F2A24"/>
+          <w:sz w:val="21"/>
+          <w:szCs w:val="21"/>
+        </w:rPr>
         <w:t xml:space="preserve">Read every on-screen number against section 3 and its source.</w:t>
       </w:r>
     </w:p>
@@ -9300,7 +10929,7 @@
                 <w:sz w:val="18"/>
                 <w:szCs w:val="18"/>
               </w:rPr>
-              <w:t xml:space="preserve">05 Reef</w:t>
+              <w:t xml:space="preserve">▲ 05 Reef (six plates, one per hold)</w:t>
             </w:r>
           </w:p>
         </w:tc>
@@ -9328,7 +10957,7 @@
                 <w:sz w:val="18"/>
                 <w:szCs w:val="18"/>
               </w:rPr>
-              <w:t xml:space="preserve">Underwater, 4 m deep, across bare granite. Purple sea urchins carpeting the rock, one stunted kelp stipe, a sheephead fish passing.</w:t>
+              <w:t xml:space="preserve">Hold 2026: underwater, 4 m deep, across bare granite; purple sea urchins carpeting the rock, one stunted kelp stipe, a sheephead passing. Hold 2034: a dozen young kelp stipes, urchins thinning. Hold 2047: canopy thinned and tattered, urchins back on the rock, water warmer and hazier.</w:t>
             </w:r>
           </w:p>
         </w:tc>
@@ -9356,7 +10985,7 @@
                 <w:sz w:val="18"/>
                 <w:szCs w:val="18"/>
               </w:rPr>
-              <w:t xml:space="preserve">Same rock under a giant-kelp canopy with light shafts. A southern sea otter dives down, prises a crab from a crevice and rises out of frame.</w:t>
+              <w:t xml:space="preserve">Hold 2061: a full giant-kelp canopy with light shafts, rockfish and señorita wrasse among the stipes. Hold 2083: the same canopy; a raft of three southern sea otters at the surface seen from below. Hold 2100: an otter diving to the crevice where the sheephead passed, prising out a crab; a few urchins still visible on the rock. Each hold generated from the same locked plate; the ticks between holds are cross-dissolves made in post, never generated.</w:t>
             </w:r>
           </w:p>
         </w:tc>
@@ -9386,7 +11015,7 @@
                 <w:sz w:val="18"/>
                 <w:szCs w:val="18"/>
               </w:rPr>
-              <w:t xml:space="preserve">06 Waterhole</w:t>
+              <w:t xml:space="preserve">▲ 06 Waterhole (moments, cut together in post)</w:t>
             </w:r>
           </w:p>
         </w:tc>
@@ -9414,7 +11043,7 @@
                 <w:sz w:val="18"/>
                 <w:szCs w:val="18"/>
               </w:rPr>
-              <w:t xml:space="preserve">Dusk at a muddy pan. A lone brown hyaena with a wire scar on a foreleg drinks, flinches, leaves.</w:t>
+              <w:t xml:space="preserve">Night at a muddy pan under stars, infrared. Moments: 17:48 dusk, empty; 21:10 empty, wind in grass; 02:40 a lone brown hyaena with a wire scar on a foreleg drinks, flinches, leaves; 05:12 grey dawn, empty. A snapped fence post at the pan's edge in every moment.</w:t>
             </w:r>
           </w:p>
         </w:tc>
@@ -9442,7 +11071,7 @@
                 <w:sz w:val="18"/>
                 <w:szCs w:val="18"/>
               </w:rPr>
-              <w:t xml:space="preserve">Same pan. A brown hyaena clan with cubs drinks; a lioness arrives and the hyaenas withdraw without hurry; an elephant's legs cross the foreground in the final second.</w:t>
+              <w:t xml:space="preserve">Same pan, same night, colour low-light. Moments: 17:48 a brown hyaena clan with cubs drinking; 21:10 a lioness arrives and the hyaenas step back without hurry; 00:00 elephants, legs and trunks filling the foreground, the frame jolting once; 03:30 impala and a warthog in the grey; 04:00 a leopard drinking alone; 05:12 the same grey dawn. Fence post in every moment.</w:t>
             </w:r>
           </w:p>
         </w:tc>
@@ -9472,7 +11101,7 @@
                 <w:sz w:val="18"/>
                 <w:szCs w:val="18"/>
               </w:rPr>
-              <w:t xml:space="preserve">07 Creek</w:t>
+              <w:t xml:space="preserve">▲ 07 Creek</w:t>
             </w:r>
           </w:p>
         </w:tc>
@@ -9528,7 +11157,7 @@
                 <w:sz w:val="18"/>
                 <w:szCs w:val="18"/>
               </w:rPr>
-              <w:t xml:space="preserve">Same creek. A fishing cat wades in, freezes, strikes and lifts a fish; it walks toward the camera until its face fills the frame. One bottle remains wedged in the roots.</w:t>
+              <w:t xml:space="preserve">Clip A: same creek, a fishing cat wades in, freezes, strikes, lifts a fish, walks toward the camera until one eye fills the frame; in the eye's reflection, a small camera housing strapped to a mangrove root. Clip B (camera fallen): the view from mud level looking up through mangrove canopy at dawn sky, the housing's lens hood edge soft in the corner; a white-throated kingfisher lands on the housing and looks down into the lens. One bottle wedged in the roots in both. The shove and tumble between A and B are made in post from the two plates.</w:t>
             </w:r>
           </w:p>
         </w:tc>
@@ -9663,6 +11292,25 @@
           <w:szCs w:val="21"/>
         </w:rPr>
         <w:t xml:space="preserve">Any asset, recording or font whose licence is not in the rights log.</w:t>
+      </w:r>
+    </w:p>
+    <w:p>
+      <w:pPr>
+        <w:pStyle w:val="ListParagraph"/>
+        <w:numPr>
+          <w:ilvl w:val="0"/>
+          <w:numId w:val="2"/>
+        </w:numPr>
+        <w:spacing w:after="60" w:before="0"/>
+      </w:pPr>
+      <w:r>
+        <w:rPr>
+          <w:rFonts w:ascii="Calibri" w:cs="Calibri" w:eastAsia="Calibri" w:hAnsi="Calibri"/>
+          <w:color w:val="1F2A24"/>
+          <w:sz w:val="21"/>
+          <w:szCs w:val="21"/>
+        </w:rPr>
+        <w:t xml:space="preserve">▲ Speed-ramped or sped-up animal motion in station 06; a year ticker faster than 8 per second in station 05; any reflection in the cat's eye other than the camera.</w:t>
       </w:r>
     </w:p>
     <w:p>

</xml_diff>

<commit_message>
Motion Detected: review of cut v5 with the rebuild plan from 55 s; guide revision 3 aligned to the cut
Co-Authored-By: Claude Fable 5.1 <noreply@anthropic.com>
Claude-Session: https://claude.ai/code/session_01Gw2TNCA3kZvybTQmQHep3g
</commit_message>
<xml_diff>
--- a/good-food-no-dead-ends/briefs/Motion_Detected_2100_Production_Guide.docx
+++ b/good-food-no-dead-ends/briefs/Motion_Detected_2100_Production_Guide.docx
@@ -59,7 +59,7 @@
           <w:sz w:val="19"/>
           <w:szCs w:val="19"/>
         </w:rPr>
-        <w:t xml:space="preserve">REVISION 2 · The first four stations (0–55 s) stand as cut. Everything from 55 s is rebuilt in this revision: the film changes shape there instead of repeating its pattern. Changed sections are marked ▲.</w:t>
+        <w:t xml:space="preserve">REVISION 3 · Aligned to cut v5. Stations 01–04 stand as cut (four small fixes listed in the companion review). From 55 s the film is rebuilt to change shape instead of repeating its pattern. Station 06 is now spotted hyaena, as filmed; station 03 is house martin unless its 2100 clip is regenerated with a swift brick. Changed sections are marked ▲.</w:t>
       </w:r>
     </w:p>
     <w:p>
@@ -1425,7 +1425,7 @@
                 <w:sz w:val="18"/>
                 <w:szCs w:val="18"/>
               </w:rPr>
-              <w:t xml:space="preserve">Brown hyaena filmed for the first time in Zinave National Park, Mozambique (2023–24 camera grid)</w:t>
+              <w:t xml:space="preserve">Zinave National Park, Mozambique: a camera grid (2023–24) records the return of spotted hyaena, leopard and lion, and the first brown hyaena</w:t>
             </w:r>
           </w:p>
         </w:tc>
@@ -1453,7 +1453,7 @@
                 <w:sz w:val="18"/>
                 <w:szCs w:val="18"/>
               </w:rPr>
-              <w:t xml:space="preserve">A park rebuilt after civil war, where spotted hyaena, leopard and lion have already returned.</w:t>
+              <w:t xml:space="preserve">A park rebuilt after civil war, restocked and patrolled; the camera grid is how the recovery is counted.</w:t>
             </w:r>
           </w:p>
         </w:tc>
@@ -1481,7 +1481,7 @@
                 <w:sz w:val="18"/>
                 <w:szCs w:val="18"/>
               </w:rPr>
-              <w:t xml:space="preserve">The model for the savanna station: a camera grid that records who comes back as a park is rebuilt.</w:t>
+              <w:t xml:space="preserve">The model for the savanna station: a camera grid that records who comes back as a park is rebuilt. The station's animal is the spotted hyaena, as filmed.</w:t>
             </w:r>
           </w:p>
         </w:tc>
@@ -3008,7 +3008,7 @@
                 <w:sz w:val="18"/>
                 <w:szCs w:val="18"/>
               </w:rPr>
-              <w:t xml:space="preserve">2026, 19:05: swifts scream past at speed; one brakes at a sealed-over cavity, finds nothing, peels away.</w:t>
+              <w:t xml:space="preserve">2026, 19:05: a bird brakes at a sealed-over cavity, finds nothing, peels away.</w:t>
             </w:r>
           </w:p>
         </w:tc>
@@ -3036,7 +3036,7 @@
                 <w:sz w:val="18"/>
                 <w:szCs w:val="18"/>
               </w:rPr>
-              <w:t xml:space="preserve">2100, 19:05: a row of nest bricks; an adult swift slams in; chicks' heads appear; another adult arrives with a throat bulging with insects.</w:t>
+              <w:t xml:space="preserve">2100, 19:05, as cut: a mud-cup nest in the opening, three gaping chicks, an adult arriving. That is a house-martin nest, so the station is house martins (UK Red List since 2021; artificial nest cups are occupied in trials). If the team prefers swifts, the 2100 clip must be regenerated with a swift brick, since swifts never build mud cups.</w:t>
             </w:r>
           </w:p>
         </w:tc>
@@ -3064,7 +3064,7 @@
                 <w:sz w:val="18"/>
                 <w:szCs w:val="18"/>
               </w:rPr>
-              <w:t xml:space="preserve">Nest bricks in building law</w:t>
+              <w:t xml:space="preserve">Nest provision in building law and retrofit</w:t>
             </w:r>
           </w:p>
         </w:tc>
@@ -3434,7 +3434,7 @@
                 <w:sz w:val="18"/>
                 <w:szCs w:val="18"/>
               </w:rPr>
-              <w:t xml:space="preserve">2026: the night runs through at speed; the pan sits empty under the stars; at 02:40 a single brown hyaena, a wire scar on one foreleg, drinks and goes. Dawn. Nothing else came.</w:t>
+              <w:t xml:space="preserve">2026: the night runs through at speed; the pan sits empty under the stars; at 02:40 a single spotted hyaena, a wire scar on one foreleg, drinks and goes. Dawn. Nothing else came.</w:t>
             </w:r>
           </w:p>
         </w:tc>
@@ -4085,7 +4085,7 @@
                 <w:sz w:val="18"/>
                 <w:szCs w:val="18"/>
               </w:rPr>
-              <w:t xml:space="preserve">A swift braking at a cement-sealed hole and finding nothing.</w:t>
+              <w:t xml:space="preserve">A bird braking at a cement-sealed hole and finding nothing.</w:t>
             </w:r>
           </w:p>
         </w:tc>
@@ -4113,7 +4113,7 @@
                 <w:sz w:val="18"/>
                 <w:szCs w:val="18"/>
               </w:rPr>
-              <w:t xml:space="preserve">The same wall, now with a row of nest bricks; a swift slamming into one.</w:t>
+              <w:t xml:space="preserve">The same wall, the opening now holding a nest with chicks (house-martin cup as cut, or a swift brick if regenerated).</w:t>
             </w:r>
           </w:p>
         </w:tc>
@@ -4141,7 +4141,7 @@
                 <w:sz w:val="18"/>
                 <w:szCs w:val="18"/>
               </w:rPr>
-              <w:t xml:space="preserve">The sealed hole is still visible beside the bricks.</w:t>
+              <w:t xml:space="preserve">The patched render around the opening is still visible.</w:t>
             </w:r>
           </w:p>
         </w:tc>
@@ -4427,7 +4427,7 @@
                 <w:sz w:val="18"/>
                 <w:szCs w:val="18"/>
               </w:rPr>
-              <w:t xml:space="preserve">One hyaena with a wire scar at 02:40; an otherwise empty night.</w:t>
+              <w:t xml:space="preserve">One spotted hyaena at 02:40 (the v5 clip); an otherwise empty night.</w:t>
             </w:r>
           </w:p>
         </w:tc>
@@ -4455,7 +4455,7 @@
                 <w:sz w:val="18"/>
                 <w:szCs w:val="18"/>
               </w:rPr>
-              <w:t xml:space="preserve">The same pan, the same clock, never empty; a leopard at the same hour the lone hyaena came.</w:t>
+              <w:t xml:space="preserve">The same pan, the same clock, never empty; a leopard at the hour the lone hyaena came.</w:t>
             </w:r>
           </w:p>
         </w:tc>
@@ -11043,7 +11043,7 @@
                 <w:sz w:val="18"/>
                 <w:szCs w:val="18"/>
               </w:rPr>
-              <w:t xml:space="preserve">Night at a muddy pan under stars, infrared. Moments: 17:48 dusk, empty; 21:10 empty, wind in grass; 02:40 a lone brown hyaena with a wire scar on a foreleg drinks, flinches, leaves; 05:12 grey dawn, empty. A snapped fence post at the pan's edge in every moment.</w:t>
+              <w:t xml:space="preserve">Night at a muddy pan under stars, infrared. Moments: 17:48 dusk, empty; 21:10 empty, wind in grass; 02:40 a lone spotted hyaena with a wire scar on a foreleg drinks, flinches, leaves; 05:12 grey dawn, empty. A snapped fence post at the pan's edge in every moment.</w:t>
             </w:r>
           </w:p>
         </w:tc>
@@ -11071,7 +11071,7 @@
                 <w:sz w:val="18"/>
                 <w:szCs w:val="18"/>
               </w:rPr>
-              <w:t xml:space="preserve">Same pan, same night, colour low-light. Moments: 17:48 a brown hyaena clan with cubs drinking; 21:10 a lioness arrives and the hyaenas step back without hurry; 00:00 elephants, legs and trunks filling the foreground, the frame jolting once; 03:30 impala and a warthog in the grey; 04:00 a leopard drinking alone; 05:12 the same grey dawn. Fence post in every moment.</w:t>
+              <w:t xml:space="preserve">Same pan, same night, colour low-light. Moments: 17:48 a spotted hyaena clan with cubs drinking; 21:10 a lioness arrives and the hyaenas step back without hurry; 00:00 elephants, legs and trunks filling the foreground, the frame jolting once; 03:30 impala and a warthog in the grey; 04:00 a leopard drinking alone; 05:12 the same grey dawn. Fence post in every moment.</w:t>
             </w:r>
           </w:p>
         </w:tc>
@@ -11789,7 +11789,7 @@
           <w:sz w:val="21"/>
           <w:szCs w:val="21"/>
         </w:rPr>
-        <w:t xml:space="preserve">Check List (Pensoft): first brown hyaena records in Zinave National Park</w:t>
+        <w:t xml:space="preserve">Check List (Pensoft): first spotted hyaena records in Zinave National Park</w:t>
       </w:r>
       <w:r>
         <w:rPr>

</xml_diff>